<commit_message>
Actualizar presentacion completa del concurso, CV, certificados y plan de trabajo
</commit_message>
<xml_diff>
--- a/proyecto prueba/Proyecto Guido.docx
+++ b/proyecto prueba/Proyecto Guido.docx
@@ -203,8 +203,6 @@
       <w:r>
         <w:t>Pueyrredón</w:t>
       </w:r>
-      <w:bookmarkStart w:id="0" w:name="_GoBack"/>
-      <w:bookmarkEnd w:id="0"/>
       <w:r>
         <w:t>.</w:t>
       </w:r>
@@ -218,7 +216,13 @@
     <w:p/>
     <w:p>
       <w:r>
-        <w:t xml:space="preserve">La Jefatura debe desempeñar un rol integrador que trascienda la coordinación técnica. Su responsabilidad central consiste en combinar conocimientos técnicos con planificación, conducción de equipos y administración de recursos, generando condiciones para desarrollar software de manera previsible, colaborativa y sostenible. En este marco, promoverá la integración humana, la reutilización del conocimiento y la adopción responsable de nuevas tecnologías, consolidando la optimización de los procedimientos organizacionales como la columna vertebral que asegure que el código no solo funcione, sino que sea escalable, seguro y </w:t>
+        <w:t>La Jefatura debe desempeñar un rol integrador que trascienda la coordinación técnica. Su responsabilidad central consiste en combinar conocimientos técnicos con planificación, conducción de equipos y administración de recursos, generando condiciones para desarrollar software de manera previsible, colaborativa y sostenible. En este marco, promover</w:t>
+      </w:r>
+      <w:r>
+        <w:t>é</w:t>
+      </w:r>
+      <w:r>
+        <w:t xml:space="preserve"> la integración humana, la reutilización del conocimiento y la adopción responsable de nuevas tecnologías, consolidando la optimización de los procedimientos organizacionales como la columna vertebral que asegure que el código no solo funcione, sino que sea escalable, seguro y </w:t>
       </w:r>
       <w:r>
         <w:lastRenderedPageBreak/>
@@ -927,6 +931,27 @@
           <w:color w:val="auto"/>
           <w:sz w:val="22"/>
           <w:szCs w:val="22"/>
+          <w:u w:val="single"/>
+        </w:rPr>
+      </w:pPr>
+      <w:r>
+        <w:rPr>
+          <w:color w:val="auto"/>
+          <w:sz w:val="22"/>
+          <w:szCs w:val="22"/>
+        </w:rPr>
+        <w:lastRenderedPageBreak/>
+        <w:t>• Desarrollo y proyección profesional: Se promoverá el conocimiento de las expectativas, intereses y proyección profesional y laboral de cada integrante del Departamento, identificando capacidades, intereses y necesidades de desarrollo. Sobre esta información se diseñarán estrategias de crecimiento, capacitación, asignación de responsabilidades y retención del talento, procurando alinear las expectativas individuales con las necesidades presentes y futuras del Departamento</w:t>
+      </w:r>
+    </w:p>
+    <w:p>
+      <w:pPr>
+        <w:pStyle w:val="Ttulo2"/>
+        <w:ind w:left="708"/>
+        <w:rPr>
+          <w:color w:val="auto"/>
+          <w:sz w:val="22"/>
+          <w:szCs w:val="22"/>
         </w:rPr>
       </w:pPr>
     </w:p>
@@ -939,7 +964,6 @@
           <w:b/>
           <w:bCs/>
         </w:rPr>
-        <w:lastRenderedPageBreak/>
         <w:t>3.2 Gestión orientada a procesos</w:t>
       </w:r>
     </w:p>
@@ -1059,72 +1083,116 @@
     </w:p>
     <w:p>
       <w:r>
+        <w:lastRenderedPageBreak/>
         <w:t>El presente Plan de Trabajo persigue los siguientes objetivos estratégicos para el fortalecimiento integral del Departamento:</w:t>
       </w:r>
     </w:p>
     <w:p>
       <w:pPr>
-        <w:ind w:left="708"/>
-      </w:pPr>
-      <w:r>
-        <w:t>• Optimizar la planificación y priorización de requerimientos para reducir progresivamente la atención reactiva de emergencias.</w:t>
-      </w:r>
-    </w:p>
-    <w:p>
-      <w:pPr>
-        <w:ind w:left="708"/>
-      </w:pPr>
-      <w:r>
-        <w:t>• Centralizar y visibilizar la gestión y el seguimiento de solicitudes, proyectos e incidencias en la plataforma institucional de gestión.</w:t>
-      </w:r>
-    </w:p>
-    <w:p>
-      <w:pPr>
-        <w:ind w:left="708"/>
-      </w:pPr>
-      <w:r>
-        <w:lastRenderedPageBreak/>
-        <w:t>• Preservar el conocimiento institucional y mitigar los riesgos operativos mediante el fortalecimiento de la documentación y la transferencia técnica.</w:t>
-      </w:r>
-    </w:p>
-    <w:p>
-      <w:pPr>
-        <w:ind w:left="708"/>
-      </w:pPr>
-      <w:r>
-        <w:t>• Establecer estándares técnicos y criterios homogéneos de calidad para el desarrollo, mantenimiento y arquitectura de software.</w:t>
-      </w:r>
-    </w:p>
-    <w:p>
-      <w:pPr>
-        <w:ind w:left="708"/>
-      </w:pPr>
-      <w:r>
-        <w:t>• Fortalecer la coordinación, la comunicación y la sinergia entre los equipos de trabajo distribuidos.</w:t>
-      </w:r>
-    </w:p>
-    <w:p>
-      <w:pPr>
-        <w:ind w:left="708"/>
-      </w:pPr>
-      <w:r>
-        <w:t>• Consolidar el gobierno técnico y la soberanía sobre los desarrollos de software realizados por proveedores externos.</w:t>
-      </w:r>
-    </w:p>
-    <w:p>
-      <w:pPr>
-        <w:ind w:left="708"/>
-      </w:pPr>
-      <w:r>
-        <w:t>• Promover la incorporación progresiva y responsable de nuevas herramientas tecnológicas de apoyo al desarrollo.</w:t>
-      </w:r>
-    </w:p>
-    <w:p>
-      <w:pPr>
-        <w:ind w:left="708"/>
-      </w:pPr>
-      <w:r>
-        <w:t>• Optimizar la distribución de funciones operativas considerando la trayectoria y experiencia acumulada por el personal.</w:t>
+        <w:pStyle w:val="Prrafodelista"/>
+        <w:numPr>
+          <w:ilvl w:val="0"/>
+          <w:numId w:val="23"/>
+        </w:numPr>
+      </w:pPr>
+      <w:r>
+        <w:t>Optimizar la planificación y priorización de requerimientos para reducir progresivamente la atención reactiva de emergencias.</w:t>
+      </w:r>
+    </w:p>
+    <w:p>
+      <w:pPr>
+        <w:pStyle w:val="Prrafodelista"/>
+        <w:numPr>
+          <w:ilvl w:val="0"/>
+          <w:numId w:val="23"/>
+        </w:numPr>
+      </w:pPr>
+      <w:r>
+        <w:t>Centralizar y visibilizar la gestión y el seguimiento de solicitudes, proyectos e incidencias en la plataforma institucional de gestión.</w:t>
+      </w:r>
+    </w:p>
+    <w:p>
+      <w:pPr>
+        <w:pStyle w:val="Prrafodelista"/>
+        <w:numPr>
+          <w:ilvl w:val="0"/>
+          <w:numId w:val="23"/>
+        </w:numPr>
+      </w:pPr>
+      <w:r>
+        <w:t>Preservar el conocimiento institucional y mitigar los riesgos operativos mediante el fortalecimiento de la documentación y la transferencia técnica.</w:t>
+      </w:r>
+    </w:p>
+    <w:p>
+      <w:pPr>
+        <w:pStyle w:val="Prrafodelista"/>
+        <w:numPr>
+          <w:ilvl w:val="0"/>
+          <w:numId w:val="23"/>
+        </w:numPr>
+      </w:pPr>
+      <w:r>
+        <w:t>Establecer estándares técnicos y criterios homogéneos de calidad para el desarrollo, mantenimiento y arquitectura de software.</w:t>
+      </w:r>
+    </w:p>
+    <w:p>
+      <w:pPr>
+        <w:pStyle w:val="Prrafodelista"/>
+        <w:numPr>
+          <w:ilvl w:val="0"/>
+          <w:numId w:val="23"/>
+        </w:numPr>
+      </w:pPr>
+      <w:r>
+        <w:t>Fortalecer la coordinación, la comunicación y la sinergia entre los equipos de trabajo distribuidos.</w:t>
+      </w:r>
+    </w:p>
+    <w:p>
+      <w:pPr>
+        <w:pStyle w:val="Prrafodelista"/>
+        <w:numPr>
+          <w:ilvl w:val="0"/>
+          <w:numId w:val="23"/>
+        </w:numPr>
+      </w:pPr>
+      <w:r>
+        <w:t>Consolidar el gobierno técnico y la soberanía sobre los desarrollos de software realizados por proveedores externos.</w:t>
+      </w:r>
+    </w:p>
+    <w:p>
+      <w:pPr>
+        <w:pStyle w:val="Prrafodelista"/>
+        <w:numPr>
+          <w:ilvl w:val="0"/>
+          <w:numId w:val="23"/>
+        </w:numPr>
+      </w:pPr>
+      <w:r>
+        <w:t>Promover la incorporación progresiva y responsable de nuevas herramientas tecnológicas de apoyo al desarrollo.</w:t>
+      </w:r>
+    </w:p>
+    <w:p>
+      <w:pPr>
+        <w:pStyle w:val="Prrafodelista"/>
+        <w:numPr>
+          <w:ilvl w:val="0"/>
+          <w:numId w:val="23"/>
+        </w:numPr>
+      </w:pPr>
+      <w:r>
+        <w:t>Optimizar la distribución de funciones y promover el desarrollo y proyección profesional del personal, considerando su trayectoria, experiencia, capacidades e intereses.</w:t>
+      </w:r>
+    </w:p>
+    <w:p>
+      <w:pPr>
+        <w:pStyle w:val="Prrafodelista"/>
+        <w:numPr>
+          <w:ilvl w:val="0"/>
+          <w:numId w:val="22"/>
+        </w:numPr>
+      </w:pPr>
+      <w:r>
+        <w:t>Fortalecer la retención del conocimiento y del talento institucional mediante estrategias de desarrollo profesional y crecimiento interno.</w:t>
       </w:r>
     </w:p>
     <w:p/>
@@ -1345,6 +1413,7 @@
           <w:sz w:val="24"/>
           <w:szCs w:val="24"/>
         </w:rPr>
+        <w:lastRenderedPageBreak/>
         <w:t>Propuesta</w:t>
       </w:r>
     </w:p>
@@ -1504,7 +1573,6 @@
           <w:sz w:val="22"/>
           <w:szCs w:val="22"/>
         </w:rPr>
-        <w:lastRenderedPageBreak/>
         <w:t xml:space="preserve">• </w:t>
       </w:r>
       <w:proofErr w:type="gramStart"/>
@@ -2038,6 +2106,7 @@
           <w:sz w:val="22"/>
           <w:szCs w:val="22"/>
         </w:rPr>
+        <w:lastRenderedPageBreak/>
         <w:t>revisión</w:t>
       </w:r>
       <w:proofErr w:type="gramEnd"/>
@@ -2128,7 +2197,6 @@
           <w:sz w:val="24"/>
           <w:szCs w:val="24"/>
         </w:rPr>
-        <w:lastRenderedPageBreak/>
         <w:t>Problema</w:t>
       </w:r>
     </w:p>
@@ -2432,6 +2500,7 @@
           <w:sz w:val="22"/>
           <w:szCs w:val="22"/>
         </w:rPr>
+        <w:lastRenderedPageBreak/>
         <w:t>Se institucionalizará un procedimiento único para el relevamiento, análisis y priorización de requerimientos, fortaleciendo el rol de la Jefatura como nexo entre las áreas usuarias y el equipo técnico</w:t>
       </w:r>
       <w:r>
@@ -2552,7 +2621,6 @@
         <w:jc w:val="left"/>
       </w:pPr>
       <w:r>
-        <w:lastRenderedPageBreak/>
         <w:t>impacto e integración con otros sistemas municipales;</w:t>
       </w:r>
     </w:p>
@@ -2877,6 +2945,7 @@
         <w:rPr>
           <w:rFonts w:eastAsia="Times New Roman"/>
         </w:rPr>
+        <w:lastRenderedPageBreak/>
         <w:t>Se fortalecerá la soberanía tecnológica del Municipio, se reducirá la dependencia de proveedores externos y se favorecerá el desarrollo de soluciones alineadas con los procesos administrativos y las necesidades de las áreas usuarias, mediante la participación activa del personal del Departamento con conocimiento funcional en cada proyecto.</w:t>
       </w:r>
     </w:p>
@@ -3371,6 +3440,7 @@
           <w:sz w:val="22"/>
           <w:szCs w:val="22"/>
         </w:rPr>
+        <w:lastRenderedPageBreak/>
         <w:t>La Jefatura institucionalizará un esquema permanente de coordinación transversal aprovechando las herramientas institucionales ya disponibles. El objetivo es garantizar que todos los integrantes del Departamento compartan información sobre proyectos en curso, dificultades detectadas y prioridades institucionales, independientemente de su ubicación física.</w:t>
       </w:r>
     </w:p>
@@ -3483,7 +3553,6 @@
         <w:rPr>
           <w:rFonts w:eastAsia="Times New Roman"/>
         </w:rPr>
-        <w:lastRenderedPageBreak/>
         <w:t>criterios comunes para registrar avances, bloqueos y decisiones técnicas relevantes;</w:t>
       </w:r>
     </w:p>
@@ -3748,14 +3817,14 @@
         <w:rPr>
           <w:rFonts w:eastAsia="Times New Roman"/>
         </w:rPr>
-        <w:t>asignación</w:t>
+        <w:t>relevamiento</w:t>
       </w:r>
       <w:proofErr w:type="gramEnd"/>
       <w:r>
         <w:rPr>
           <w:rFonts w:eastAsia="Times New Roman"/>
         </w:rPr>
-        <w:t xml:space="preserve"> de referentes funcionales según la trayectoria y experiencia de cada integrante;</w:t>
+        <w:t xml:space="preserve"> individual de las expectativas, intereses y proyección profesional y laboral de los integrantes del Departamento;</w:t>
       </w:r>
     </w:p>
     <w:p>
@@ -3766,26 +3835,6 @@
           <w:rFonts w:eastAsia="Times New Roman"/>
         </w:rPr>
       </w:pPr>
-      <w:r>
-        <w:rPr>
-          <w:rFonts w:eastAsia="Times New Roman"/>
-        </w:rPr>
-        <w:t xml:space="preserve">• </w:t>
-      </w:r>
-      <w:proofErr w:type="gramStart"/>
-      <w:r>
-        <w:rPr>
-          <w:rFonts w:eastAsia="Times New Roman"/>
-        </w:rPr>
-        <w:t>distribución</w:t>
-      </w:r>
-      <w:proofErr w:type="gramEnd"/>
-      <w:r>
-        <w:rPr>
-          <w:rFonts w:eastAsia="Times New Roman"/>
-        </w:rPr>
-        <w:t xml:space="preserve"> de tareas priorizando la experiencia en los procesos administrativos municipales;</w:t>
-      </w:r>
     </w:p>
     <w:p>
       <w:pPr>
@@ -3806,14 +3855,14 @@
         <w:rPr>
           <w:rFonts w:eastAsia="Times New Roman"/>
         </w:rPr>
-        <w:t>acompañamiento</w:t>
+        <w:t>identificación</w:t>
       </w:r>
       <w:proofErr w:type="gramEnd"/>
       <w:r>
         <w:rPr>
           <w:rFonts w:eastAsia="Times New Roman"/>
         </w:rPr>
-        <w:t xml:space="preserve"> de los perfiles experimentados a los agentes de más reciente incorporación;</w:t>
+        <w:t xml:space="preserve"> de capacidades, conocimientos e intereses que puedan ser aprovechados en función de las necesidades actuales y futuras del área;</w:t>
       </w:r>
     </w:p>
     <w:p>
@@ -3824,26 +3873,6 @@
           <w:rFonts w:eastAsia="Times New Roman"/>
         </w:rPr>
       </w:pPr>
-      <w:r>
-        <w:rPr>
-          <w:rFonts w:eastAsia="Times New Roman"/>
-        </w:rPr>
-        <w:t xml:space="preserve">• </w:t>
-      </w:r>
-      <w:proofErr w:type="gramStart"/>
-      <w:r>
-        <w:rPr>
-          <w:rFonts w:eastAsia="Times New Roman"/>
-        </w:rPr>
-        <w:t>revisión</w:t>
-      </w:r>
-      <w:proofErr w:type="gramEnd"/>
-      <w:r>
-        <w:rPr>
-          <w:rFonts w:eastAsia="Times New Roman"/>
-        </w:rPr>
-        <w:t xml:space="preserve"> periódica de la asignación de roles según la evolución de cada proyecto.</w:t>
-      </w:r>
     </w:p>
     <w:p>
       <w:pPr>
@@ -3853,6 +3882,188 @@
           <w:rFonts w:eastAsia="Times New Roman"/>
         </w:rPr>
       </w:pPr>
+      <w:r>
+        <w:rPr>
+          <w:rFonts w:eastAsia="Times New Roman"/>
+        </w:rPr>
+        <w:lastRenderedPageBreak/>
+        <w:t xml:space="preserve">• </w:t>
+      </w:r>
+      <w:proofErr w:type="gramStart"/>
+      <w:r>
+        <w:rPr>
+          <w:rFonts w:eastAsia="Times New Roman"/>
+        </w:rPr>
+        <w:t>asignación</w:t>
+      </w:r>
+      <w:proofErr w:type="gramEnd"/>
+      <w:r>
+        <w:rPr>
+          <w:rFonts w:eastAsia="Times New Roman"/>
+        </w:rPr>
+        <w:t xml:space="preserve"> de referentes funcionales según la trayectoria, experiencia y perfil de cada integrante;</w:t>
+      </w:r>
+    </w:p>
+    <w:p>
+      <w:pPr>
+        <w:pStyle w:val="Prrafodelista"/>
+        <w:ind w:left="720"/>
+        <w:rPr>
+          <w:rFonts w:eastAsia="Times New Roman"/>
+        </w:rPr>
+      </w:pPr>
+    </w:p>
+    <w:p>
+      <w:pPr>
+        <w:pStyle w:val="Prrafodelista"/>
+        <w:ind w:left="720"/>
+        <w:rPr>
+          <w:rFonts w:eastAsia="Times New Roman"/>
+        </w:rPr>
+      </w:pPr>
+      <w:r>
+        <w:rPr>
+          <w:rFonts w:eastAsia="Times New Roman"/>
+        </w:rPr>
+        <w:t xml:space="preserve">• </w:t>
+      </w:r>
+      <w:proofErr w:type="gramStart"/>
+      <w:r>
+        <w:rPr>
+          <w:rFonts w:eastAsia="Times New Roman"/>
+        </w:rPr>
+        <w:t>distribución</w:t>
+      </w:r>
+      <w:proofErr w:type="gramEnd"/>
+      <w:r>
+        <w:rPr>
+          <w:rFonts w:eastAsia="Times New Roman"/>
+        </w:rPr>
+        <w:t xml:space="preserve"> de tareas procurando compatibilizar las necesidades del Departamento con las posibilidades de desarrollo profesional de los agentes;</w:t>
+      </w:r>
+    </w:p>
+    <w:p>
+      <w:pPr>
+        <w:pStyle w:val="Prrafodelista"/>
+        <w:ind w:left="720"/>
+        <w:rPr>
+          <w:rFonts w:eastAsia="Times New Roman"/>
+        </w:rPr>
+      </w:pPr>
+    </w:p>
+    <w:p>
+      <w:pPr>
+        <w:pStyle w:val="Prrafodelista"/>
+        <w:ind w:left="720"/>
+        <w:rPr>
+          <w:rFonts w:eastAsia="Times New Roman"/>
+        </w:rPr>
+      </w:pPr>
+      <w:r>
+        <w:rPr>
+          <w:rFonts w:eastAsia="Times New Roman"/>
+        </w:rPr>
+        <w:t xml:space="preserve">• </w:t>
+      </w:r>
+      <w:proofErr w:type="gramStart"/>
+      <w:r>
+        <w:rPr>
+          <w:rFonts w:eastAsia="Times New Roman"/>
+        </w:rPr>
+        <w:t>acompañamiento</w:t>
+      </w:r>
+      <w:proofErr w:type="gramEnd"/>
+      <w:r>
+        <w:rPr>
+          <w:rFonts w:eastAsia="Times New Roman"/>
+        </w:rPr>
+        <w:t xml:space="preserve"> de los perfiles experimentados a los agentes de más reciente incorporación;</w:t>
+      </w:r>
+    </w:p>
+    <w:p>
+      <w:pPr>
+        <w:pStyle w:val="Prrafodelista"/>
+        <w:ind w:left="720"/>
+        <w:rPr>
+          <w:rFonts w:eastAsia="Times New Roman"/>
+        </w:rPr>
+      </w:pPr>
+    </w:p>
+    <w:p>
+      <w:pPr>
+        <w:pStyle w:val="Prrafodelista"/>
+        <w:ind w:left="720"/>
+        <w:rPr>
+          <w:rFonts w:eastAsia="Times New Roman"/>
+        </w:rPr>
+      </w:pPr>
+      <w:r>
+        <w:rPr>
+          <w:rFonts w:eastAsia="Times New Roman"/>
+        </w:rPr>
+        <w:t xml:space="preserve">• </w:t>
+      </w:r>
+      <w:proofErr w:type="gramStart"/>
+      <w:r>
+        <w:rPr>
+          <w:rFonts w:eastAsia="Times New Roman"/>
+        </w:rPr>
+        <w:t>definición</w:t>
+      </w:r>
+      <w:proofErr w:type="gramEnd"/>
+      <w:r>
+        <w:rPr>
+          <w:rFonts w:eastAsia="Times New Roman"/>
+        </w:rPr>
+        <w:t xml:space="preserve"> de estrategias de capacitación, participación en proyectos y asignación progresiva de responsabilidades orientadas al desarrollo y retención del talento;</w:t>
+      </w:r>
+    </w:p>
+    <w:p>
+      <w:pPr>
+        <w:pStyle w:val="Prrafodelista"/>
+        <w:ind w:left="720"/>
+        <w:rPr>
+          <w:rFonts w:eastAsia="Times New Roman"/>
+        </w:rPr>
+      </w:pPr>
+    </w:p>
+    <w:p>
+      <w:pPr>
+        <w:pStyle w:val="Prrafodelista"/>
+        <w:ind w:left="720"/>
+        <w:rPr>
+          <w:rFonts w:eastAsia="Times New Roman"/>
+        </w:rPr>
+      </w:pPr>
+      <w:r>
+        <w:rPr>
+          <w:rFonts w:eastAsia="Times New Roman"/>
+        </w:rPr>
+        <w:t xml:space="preserve">• </w:t>
+      </w:r>
+      <w:proofErr w:type="gramStart"/>
+      <w:r>
+        <w:rPr>
+          <w:rFonts w:eastAsia="Times New Roman"/>
+        </w:rPr>
+        <w:t>revisión</w:t>
+      </w:r>
+      <w:proofErr w:type="gramEnd"/>
+      <w:r>
+        <w:rPr>
+          <w:rFonts w:eastAsia="Times New Roman"/>
+        </w:rPr>
+        <w:t xml:space="preserve"> periódica de la asignación de roles según la evolución de cada proyecto y del desarrollo profesional de los integrantes.</w:t>
+      </w:r>
+    </w:p>
+    <w:p>
+      <w:pPr>
+        <w:pStyle w:val="Prrafodelista"/>
+        <w:ind w:left="720"/>
+        <w:rPr>
+          <w:rFonts w:eastAsia="Times New Roman"/>
+        </w:rPr>
+      </w:pPr>
     </w:p>
     <w:p>
       <w:pPr>
@@ -3882,15 +4093,16 @@
         <w:rPr>
           <w:rFonts w:eastAsia="Times New Roman"/>
         </w:rPr>
-        <w:t>Esta medida permitirá optimizar la distribución del trabajo con los recursos actuales, jerarquizar la experiencia del personal existente y mejorar la calidad en el relevamiento de necesidades con las áreas usuarias.</w:t>
-      </w:r>
-    </w:p>
-    <w:p>
-      <w:pPr>
-        <w:rPr>
-          <w:rFonts w:eastAsia="Times New Roman"/>
-        </w:rPr>
-      </w:pPr>
+        <w:t>Esta medida permitirá optimizar la distribución del trabajo con los recursos actuales, jerarquizar la experiencia del personal existente y mejorar la calidad en el relevamiento de necesidades con las áreas usuarias. Asimismo, permitirá identificar oportunidades de desarrollo profesional, fortalecer la motivación y favorecer la retenció</w:t>
+      </w:r>
+      <w:bookmarkStart w:id="0" w:name="_GoBack"/>
+      <w:bookmarkEnd w:id="0"/>
+      <w:r>
+        <w:rPr>
+          <w:rFonts w:eastAsia="Times New Roman"/>
+        </w:rPr>
+        <w:t>n del conocimiento y del talento dentro del Departamento.</w:t>
+      </w:r>
     </w:p>
     <w:p/>
     <w:p>
@@ -3926,125 +4138,125 @@
           <w:sz w:val="22"/>
           <w:szCs w:val="22"/>
         </w:rPr>
+        <w:t>Las acciones desarrolladas en el capítulo anterior pueden implementarse utilizando los recursos actualmente disponibles y constituyen una estrategia realista para mejorar el funcionamiento del Departamento.</w:t>
+      </w:r>
+    </w:p>
+    <w:p>
+      <w:pPr>
+        <w:pStyle w:val="NormalWeb"/>
+        <w:rPr>
+          <w:rFonts w:ascii="Arial" w:hAnsi="Arial" w:cs="Arial"/>
+          <w:sz w:val="22"/>
+          <w:szCs w:val="22"/>
+        </w:rPr>
+      </w:pPr>
+      <w:r>
+        <w:rPr>
+          <w:rFonts w:ascii="Arial" w:hAnsi="Arial" w:cs="Arial"/>
+          <w:sz w:val="22"/>
+          <w:szCs w:val="22"/>
+        </w:rPr>
+        <w:t>No obstante, la incorporación gradual de recursos presupuestarios permitiría consolidar y potenciar dichas acciones, incrementando la productividad del equipo, fortaleciendo la calidad del software y acelerando el proceso de modernización tecnológica.</w:t>
+      </w:r>
+    </w:p>
+    <w:p>
+      <w:pPr>
+        <w:pStyle w:val="NormalWeb"/>
+        <w:rPr>
+          <w:rFonts w:ascii="Arial" w:hAnsi="Arial" w:cs="Arial"/>
+          <w:sz w:val="22"/>
+          <w:szCs w:val="22"/>
+        </w:rPr>
+      </w:pPr>
+      <w:r>
+        <w:rPr>
+          <w:rFonts w:ascii="Arial" w:hAnsi="Arial" w:cs="Arial"/>
+          <w:sz w:val="22"/>
+          <w:szCs w:val="22"/>
+        </w:rPr>
+        <w:t>Las líneas de inversión identificadas no constituyen compromisos de adquisición ni requieren una ejecución simultánea, sino alternativas que podrán evaluarse en función de las necesidades detectadas, la disponibilidad presupuestaria y las prioridades institucionales.</w:t>
+      </w:r>
+    </w:p>
+    <w:p>
+      <w:pPr>
+        <w:pStyle w:val="NormalWeb"/>
+        <w:rPr>
+          <w:rFonts w:ascii="Arial" w:hAnsi="Arial" w:cs="Arial"/>
+          <w:sz w:val="22"/>
+          <w:szCs w:val="22"/>
+        </w:rPr>
+      </w:pPr>
+      <w:r>
+        <w:rPr>
+          <w:rFonts w:ascii="Arial" w:hAnsi="Arial" w:cs="Arial"/>
+          <w:sz w:val="22"/>
+          <w:szCs w:val="22"/>
+        </w:rPr>
+        <w:t>En este contexto, se identifican las siguientes líneas de inversión prioritaria.</w:t>
+      </w:r>
+    </w:p>
+    <w:p/>
+    <w:p>
+      <w:pPr>
+        <w:pStyle w:val="Ttulo2"/>
+        <w:rPr>
+          <w:b/>
+        </w:rPr>
+      </w:pPr>
+      <w:r>
+        <w:rPr>
+          <w:b/>
+        </w:rPr>
+        <w:t>6.1 Incorporación de herramientas profesionales de apoyo al desarrollo y asistencia técnica</w:t>
+      </w:r>
+    </w:p>
+    <w:p>
+      <w:pPr>
+        <w:pStyle w:val="Ttulo2"/>
+        <w:rPr>
+          <w:b/>
+          <w:sz w:val="24"/>
+          <w:szCs w:val="24"/>
+        </w:rPr>
+      </w:pPr>
+      <w:r>
+        <w:rPr>
+          <w:b/>
+          <w:sz w:val="24"/>
+          <w:szCs w:val="24"/>
+        </w:rPr>
+        <w:t>Problema</w:t>
+      </w:r>
+    </w:p>
+    <w:p>
+      <w:pPr>
+        <w:pStyle w:val="Ttulo2"/>
+        <w:rPr>
+          <w:color w:val="auto"/>
+          <w:sz w:val="22"/>
+          <w:szCs w:val="22"/>
+        </w:rPr>
+      </w:pPr>
+      <w:r>
+        <w:rPr>
+          <w:color w:val="auto"/>
+          <w:sz w:val="22"/>
+          <w:szCs w:val="22"/>
+        </w:rPr>
+        <w:t>La revisión de código, la generación de documentación técnica y la verificación de calidad dependen de tareas manuales, reduciendo la productividad y dificultando la aplicación uniforme de criterios técnicos.</w:t>
+      </w:r>
+    </w:p>
+    <w:p>
+      <w:pPr>
+        <w:pStyle w:val="Ttulo2"/>
+        <w:rPr>
+          <w:b/>
+          <w:sz w:val="24"/>
+          <w:szCs w:val="24"/>
+        </w:rPr>
+      </w:pPr>
+      <w:r>
         <w:lastRenderedPageBreak/>
-        <w:t>Las acciones desarrolladas en el capítulo anterior pueden implementarse utilizando los recursos actualmente disponibles y constituyen una estrategia realista para mejorar el funcionamiento del Departamento.</w:t>
-      </w:r>
-    </w:p>
-    <w:p>
-      <w:pPr>
-        <w:pStyle w:val="NormalWeb"/>
-        <w:rPr>
-          <w:rFonts w:ascii="Arial" w:hAnsi="Arial" w:cs="Arial"/>
-          <w:sz w:val="22"/>
-          <w:szCs w:val="22"/>
-        </w:rPr>
-      </w:pPr>
-      <w:r>
-        <w:rPr>
-          <w:rFonts w:ascii="Arial" w:hAnsi="Arial" w:cs="Arial"/>
-          <w:sz w:val="22"/>
-          <w:szCs w:val="22"/>
-        </w:rPr>
-        <w:t>No obstante, la incorporación gradual de recursos presupuestarios permitiría consolidar y potenciar dichas acciones, incrementando la productividad del equipo, fortaleciendo la calidad del software y acelerando el proceso de modernización tecnológica.</w:t>
-      </w:r>
-    </w:p>
-    <w:p>
-      <w:pPr>
-        <w:pStyle w:val="NormalWeb"/>
-        <w:rPr>
-          <w:rFonts w:ascii="Arial" w:hAnsi="Arial" w:cs="Arial"/>
-          <w:sz w:val="22"/>
-          <w:szCs w:val="22"/>
-        </w:rPr>
-      </w:pPr>
-      <w:r>
-        <w:rPr>
-          <w:rFonts w:ascii="Arial" w:hAnsi="Arial" w:cs="Arial"/>
-          <w:sz w:val="22"/>
-          <w:szCs w:val="22"/>
-        </w:rPr>
-        <w:t>Las líneas de inversión identificadas no constituyen compromisos de adquisición ni requieren una ejecución simultánea, sino alternativas que podrán evaluarse en función de las necesidades detectadas, la disponibilidad presupuestaria y las prioridades institucionales.</w:t>
-      </w:r>
-    </w:p>
-    <w:p>
-      <w:pPr>
-        <w:pStyle w:val="NormalWeb"/>
-        <w:rPr>
-          <w:rFonts w:ascii="Arial" w:hAnsi="Arial" w:cs="Arial"/>
-          <w:sz w:val="22"/>
-          <w:szCs w:val="22"/>
-        </w:rPr>
-      </w:pPr>
-      <w:r>
-        <w:rPr>
-          <w:rFonts w:ascii="Arial" w:hAnsi="Arial" w:cs="Arial"/>
-          <w:sz w:val="22"/>
-          <w:szCs w:val="22"/>
-        </w:rPr>
-        <w:t>En este contexto, se identifican las siguientes líneas de inversión prioritaria.</w:t>
-      </w:r>
-    </w:p>
-    <w:p/>
-    <w:p>
-      <w:pPr>
-        <w:pStyle w:val="Ttulo2"/>
-        <w:rPr>
-          <w:b/>
-        </w:rPr>
-      </w:pPr>
-      <w:r>
-        <w:rPr>
-          <w:b/>
-        </w:rPr>
-        <w:t>6.1 Incorporación de herramientas profesionales de apoyo al desarrollo y asistencia técnica</w:t>
-      </w:r>
-    </w:p>
-    <w:p>
-      <w:pPr>
-        <w:pStyle w:val="Ttulo2"/>
-        <w:rPr>
-          <w:b/>
-          <w:sz w:val="24"/>
-          <w:szCs w:val="24"/>
-        </w:rPr>
-      </w:pPr>
-      <w:r>
-        <w:rPr>
-          <w:b/>
-          <w:sz w:val="24"/>
-          <w:szCs w:val="24"/>
-        </w:rPr>
-        <w:t>Problema</w:t>
-      </w:r>
-    </w:p>
-    <w:p>
-      <w:pPr>
-        <w:pStyle w:val="Ttulo2"/>
-        <w:rPr>
-          <w:color w:val="auto"/>
-          <w:sz w:val="22"/>
-          <w:szCs w:val="22"/>
-        </w:rPr>
-      </w:pPr>
-      <w:r>
-        <w:rPr>
-          <w:color w:val="auto"/>
-          <w:sz w:val="22"/>
-          <w:szCs w:val="22"/>
-        </w:rPr>
-        <w:t>La revisión de código, la generación de documentación técnica y la verificación de calidad dependen de tareas manuales, reduciendo la productividad y dificultando la aplicación uniforme de criterios técnicos.</w:t>
-      </w:r>
-    </w:p>
-    <w:p>
-      <w:pPr>
-        <w:pStyle w:val="Ttulo2"/>
-        <w:rPr>
-          <w:b/>
-          <w:sz w:val="24"/>
-          <w:szCs w:val="24"/>
-        </w:rPr>
-      </w:pPr>
-      <w:r>
         <w:br/>
       </w:r>
       <w:r>
@@ -4307,7 +4519,6 @@
           <w:sz w:val="22"/>
           <w:szCs w:val="22"/>
         </w:rPr>
-        <w:lastRenderedPageBreak/>
         <w:t>La rápida evolución de lenguajes, metodologías y arquitecturas requiere instancias de formación especializada para actualizar constantemente al equipo más allá del aprendizaje autónomo.</w:t>
       </w:r>
     </w:p>
@@ -4546,6 +4757,7 @@
           <w:sz w:val="24"/>
           <w:szCs w:val="24"/>
         </w:rPr>
+        <w:lastRenderedPageBreak/>
         <w:t>Resultado esperado</w:t>
       </w:r>
     </w:p>
@@ -4801,7 +5013,782 @@
         <w:rPr>
           <w:rFonts w:eastAsia="Times New Roman"/>
         </w:rPr>
+        <w:t xml:space="preserve">• </w:t>
+      </w:r>
+      <w:proofErr w:type="gramStart"/>
+      <w:r>
+        <w:rPr>
+          <w:rFonts w:eastAsia="Times New Roman"/>
+        </w:rPr>
+        <w:t>articulación</w:t>
+      </w:r>
+      <w:proofErr w:type="gramEnd"/>
+      <w:r>
+        <w:rPr>
+          <w:rFonts w:eastAsia="Times New Roman"/>
+        </w:rPr>
+        <w:t xml:space="preserve"> técnica con el área de infraestructura para la optimización de los ambientes de prueba y producción.</w:t>
+      </w:r>
+    </w:p>
+    <w:p>
+      <w:pPr>
+        <w:ind w:left="708"/>
+        <w:rPr>
+          <w:rFonts w:eastAsia="Times New Roman"/>
+        </w:rPr>
+      </w:pPr>
+    </w:p>
+    <w:p>
+      <w:pPr>
+        <w:pStyle w:val="Ttulo2"/>
+        <w:rPr>
+          <w:b/>
+          <w:sz w:val="24"/>
+          <w:szCs w:val="24"/>
+        </w:rPr>
+      </w:pPr>
+      <w:r>
+        <w:rPr>
+          <w:b/>
+          <w:sz w:val="24"/>
+          <w:szCs w:val="24"/>
+        </w:rPr>
+        <w:t>Resultado esperado</w:t>
+      </w:r>
+    </w:p>
+    <w:p>
+      <w:pPr>
+        <w:pStyle w:val="Ttulo2"/>
+        <w:rPr>
+          <w:rFonts w:eastAsia="Times New Roman"/>
+          <w:color w:val="auto"/>
+          <w:sz w:val="22"/>
+          <w:szCs w:val="22"/>
+        </w:rPr>
+      </w:pPr>
+      <w:r>
+        <w:rPr>
+          <w:rFonts w:eastAsia="Times New Roman"/>
+          <w:color w:val="auto"/>
+          <w:sz w:val="22"/>
+          <w:szCs w:val="22"/>
+        </w:rPr>
+        <w:t>Se reducirá el riesgo asociado a tecnologías sin soporte, se simplificará el mantenimiento de los sistemas existentes y se incrementará la capacidad del Departamento para desarrollar nuevas soluciones digitales.</w:t>
+      </w:r>
+    </w:p>
+    <w:p>
+      <w:pPr>
+        <w:pStyle w:val="Ttulo2"/>
+        <w:rPr>
+          <w:rFonts w:eastAsia="Times New Roman"/>
+          <w:color w:val="auto"/>
+          <w:sz w:val="24"/>
+          <w:szCs w:val="24"/>
+        </w:rPr>
+      </w:pPr>
+    </w:p>
+    <w:p>
+      <w:pPr>
+        <w:pStyle w:val="Ttulo2"/>
+        <w:rPr>
+          <w:b/>
+        </w:rPr>
+      </w:pPr>
+      <w:r>
+        <w:rPr>
+          <w:b/>
+        </w:rPr>
+        <w:t>6.4 Fortalecimiento del trabajo colaborativo</w:t>
+      </w:r>
+    </w:p>
+    <w:p>
+      <w:pPr>
+        <w:pStyle w:val="Ttulo2"/>
+        <w:rPr>
+          <w:b/>
+          <w:sz w:val="24"/>
+          <w:szCs w:val="24"/>
+        </w:rPr>
+      </w:pPr>
+      <w:r>
+        <w:rPr>
+          <w:b/>
+          <w:sz w:val="24"/>
+          <w:szCs w:val="24"/>
+        </w:rPr>
+        <w:t>Problema</w:t>
+      </w:r>
+    </w:p>
+    <w:p>
+      <w:pPr>
+        <w:pStyle w:val="Ttulo2"/>
+        <w:rPr>
+          <w:rFonts w:eastAsia="Times New Roman"/>
+          <w:color w:val="auto"/>
+          <w:sz w:val="22"/>
+          <w:szCs w:val="22"/>
+        </w:rPr>
+      </w:pPr>
+      <w:r>
+        <w:rPr>
+          <w:rFonts w:eastAsia="Times New Roman"/>
+          <w:color w:val="auto"/>
+          <w:sz w:val="22"/>
+          <w:szCs w:val="22"/>
+        </w:rPr>
+        <w:t>La coordinación entre equipos distribuidos en distintas dependencias requiere herramientas que faciliten el intercambio permanente de información técnica, la colaboración continua y el acceso compartido al conocimiento institucional.</w:t>
+      </w:r>
+    </w:p>
+    <w:p>
+      <w:pPr>
+        <w:pStyle w:val="Ttulo2"/>
+        <w:rPr>
+          <w:b/>
+          <w:sz w:val="24"/>
+          <w:szCs w:val="24"/>
+        </w:rPr>
+      </w:pPr>
+      <w:r>
+        <w:br/>
+      </w:r>
+      <w:r>
+        <w:rPr>
+          <w:b/>
+          <w:sz w:val="24"/>
+          <w:szCs w:val="24"/>
+        </w:rPr>
+        <w:t>Propuesta</w:t>
+      </w:r>
+    </w:p>
+    <w:p>
+      <w:pPr>
+        <w:pStyle w:val="Ttulo2"/>
+        <w:rPr>
+          <w:rFonts w:eastAsia="Times New Roman"/>
+          <w:color w:val="auto"/>
+          <w:sz w:val="22"/>
+          <w:szCs w:val="22"/>
+        </w:rPr>
+      </w:pPr>
+      <w:r>
+        <w:rPr>
+          <w:rFonts w:eastAsia="Times New Roman"/>
+          <w:color w:val="auto"/>
+          <w:sz w:val="22"/>
+          <w:szCs w:val="22"/>
+        </w:rPr>
+        <w:t>Incorporar plataformas corporativas orientadas al trabajo colaborativo y a la gestión compartida del conocimiento, que permitan centralizar la documentación técnica de los sistemas, facilitar la revisión cruzada de código y mejorar la articulación entre los grupos de desarrollo.</w:t>
+      </w:r>
+    </w:p>
+    <w:p>
+      <w:pPr>
+        <w:pStyle w:val="Ttulo2"/>
+      </w:pPr>
+    </w:p>
+    <w:p>
+      <w:pPr>
+        <w:pStyle w:val="Ttulo2"/>
+        <w:rPr>
+          <w:b/>
+          <w:sz w:val="24"/>
+          <w:szCs w:val="24"/>
+        </w:rPr>
+      </w:pPr>
+      <w:r>
+        <w:rPr>
+          <w:b/>
+          <w:sz w:val="24"/>
+          <w:szCs w:val="24"/>
+        </w:rPr>
+        <w:t>Implementación</w:t>
+      </w:r>
+    </w:p>
+    <w:p>
+      <w:pPr>
+        <w:rPr>
+          <w:rFonts w:eastAsia="Times New Roman"/>
+          <w:sz w:val="24"/>
+          <w:szCs w:val="24"/>
+        </w:rPr>
+      </w:pPr>
+      <w:r>
+        <w:rPr>
+          <w:rFonts w:eastAsia="Times New Roman"/>
+          <w:sz w:val="24"/>
+          <w:szCs w:val="24"/>
+        </w:rPr>
+        <w:t>La implementación comprenderá:</w:t>
+      </w:r>
+    </w:p>
+    <w:p>
+      <w:pPr>
+        <w:ind w:left="708"/>
+        <w:rPr>
+          <w:rFonts w:eastAsia="Times New Roman"/>
+        </w:rPr>
+      </w:pPr>
+      <w:r>
+        <w:rPr>
+          <w:rFonts w:eastAsia="Times New Roman"/>
+        </w:rPr>
+        <w:t xml:space="preserve">• </w:t>
+      </w:r>
+      <w:proofErr w:type="gramStart"/>
+      <w:r>
+        <w:rPr>
+          <w:rFonts w:eastAsia="Times New Roman"/>
+        </w:rPr>
+        <w:t>incorporación</w:t>
+      </w:r>
+      <w:proofErr w:type="gramEnd"/>
+      <w:r>
+        <w:rPr>
+          <w:rFonts w:eastAsia="Times New Roman"/>
+        </w:rPr>
+        <w:t xml:space="preserve"> de plataformas colaborativas para la documentación técnica institucional;</w:t>
+      </w:r>
+    </w:p>
+    <w:p>
+      <w:pPr>
+        <w:ind w:left="708"/>
+        <w:rPr>
+          <w:rFonts w:eastAsia="Times New Roman"/>
+        </w:rPr>
+      </w:pPr>
+      <w:r>
+        <w:rPr>
+          <w:rFonts w:eastAsia="Times New Roman"/>
+        </w:rPr>
+        <w:t xml:space="preserve">• </w:t>
+      </w:r>
+      <w:proofErr w:type="gramStart"/>
+      <w:r>
+        <w:rPr>
+          <w:rFonts w:eastAsia="Times New Roman"/>
+        </w:rPr>
+        <w:t>implementación</w:t>
+      </w:r>
+      <w:proofErr w:type="gramEnd"/>
+      <w:r>
+        <w:rPr>
+          <w:rFonts w:eastAsia="Times New Roman"/>
+        </w:rPr>
+        <w:t xml:space="preserve"> de herramientas de repositorios de conocimiento y revisión compartida de desarrollos;</w:t>
+      </w:r>
+    </w:p>
+    <w:p>
+      <w:pPr>
+        <w:ind w:left="708"/>
+        <w:rPr>
+          <w:rFonts w:eastAsia="Times New Roman"/>
+        </w:rPr>
+      </w:pPr>
+      <w:r>
+        <w:rPr>
+          <w:rFonts w:eastAsia="Times New Roman"/>
+        </w:rPr>
+        <w:t xml:space="preserve">• </w:t>
+      </w:r>
+      <w:proofErr w:type="gramStart"/>
+      <w:r>
+        <w:rPr>
+          <w:rFonts w:eastAsia="Times New Roman"/>
+        </w:rPr>
+        <w:t>soluciones</w:t>
+      </w:r>
+      <w:proofErr w:type="gramEnd"/>
+      <w:r>
+        <w:rPr>
+          <w:rFonts w:eastAsia="Times New Roman"/>
+        </w:rPr>
+        <w:t xml:space="preserve"> que faciliten la comunicación fluida y la coordinación diaria entre equipos;</w:t>
+      </w:r>
+    </w:p>
+    <w:p>
+      <w:pPr>
+        <w:ind w:left="708"/>
+        <w:rPr>
+          <w:rFonts w:eastAsia="Times New Roman"/>
+        </w:rPr>
+      </w:pPr>
+      <w:r>
+        <w:rPr>
+          <w:rFonts w:eastAsia="Times New Roman"/>
+        </w:rPr>
+        <w:t xml:space="preserve">• </w:t>
+      </w:r>
+      <w:proofErr w:type="gramStart"/>
+      <w:r>
+        <w:rPr>
+          <w:rFonts w:eastAsia="Times New Roman"/>
+        </w:rPr>
+        <w:t>capacitación</w:t>
+      </w:r>
+      <w:proofErr w:type="gramEnd"/>
+      <w:r>
+        <w:rPr>
+          <w:rFonts w:eastAsia="Times New Roman"/>
+        </w:rPr>
+        <w:t xml:space="preserve"> al personal para promover su utilización sistemática.</w:t>
+      </w:r>
+    </w:p>
+    <w:p>
+      <w:pPr>
+        <w:ind w:left="708"/>
+        <w:rPr>
+          <w:rFonts w:eastAsia="Times New Roman"/>
+        </w:rPr>
+      </w:pPr>
+    </w:p>
+    <w:p>
+      <w:pPr>
+        <w:pStyle w:val="Ttulo2"/>
+        <w:rPr>
+          <w:b/>
+          <w:sz w:val="24"/>
+          <w:szCs w:val="24"/>
+        </w:rPr>
+      </w:pPr>
+      <w:r>
+        <w:rPr>
+          <w:b/>
+          <w:sz w:val="24"/>
+          <w:szCs w:val="24"/>
+        </w:rPr>
+        <w:t>Resultado esperado</w:t>
+      </w:r>
+    </w:p>
+    <w:p>
+      <w:pPr>
+        <w:rPr>
+          <w:rFonts w:eastAsia="Times New Roman"/>
+        </w:rPr>
+      </w:pPr>
+      <w:r>
+        <w:rPr>
+          <w:rFonts w:eastAsia="Times New Roman"/>
+        </w:rPr>
+        <w:t>Se fortalecerá la colaboración entre los distintos grupos de trabajo, se facilitará el acceso al conocimiento técnico acumulado, se eliminarán los silos informáticos y se mejorará la cohesión del Departamento.</w:t>
+      </w:r>
+    </w:p>
+    <w:p/>
+    <w:p>
+      <w:pPr>
+        <w:pStyle w:val="Ttulo2"/>
+        <w:rPr>
+          <w:b/>
+        </w:rPr>
+      </w:pPr>
+      <w:r>
+        <w:rPr>
+          <w:b/>
+        </w:rPr>
+        <w:t>6.5 Herramientas de analítica de proyectos y tableros ejecutivos</w:t>
+      </w:r>
+      <w:r>
+        <w:rPr>
+          <w:b/>
+        </w:rPr>
+        <w:tab/>
+      </w:r>
+    </w:p>
+    <w:p>
+      <w:pPr>
+        <w:pStyle w:val="Ttulo2"/>
+        <w:rPr>
+          <w:b/>
+          <w:sz w:val="24"/>
+          <w:szCs w:val="24"/>
+        </w:rPr>
+      </w:pPr>
+      <w:r>
+        <w:rPr>
+          <w:b/>
+          <w:sz w:val="24"/>
+          <w:szCs w:val="24"/>
+        </w:rPr>
+        <w:t>Problema</w:t>
+      </w:r>
+    </w:p>
+    <w:p>
+      <w:pPr>
+        <w:pStyle w:val="Ttulo2"/>
+        <w:rPr>
+          <w:rFonts w:eastAsia="Times New Roman"/>
+          <w:color w:val="auto"/>
+          <w:sz w:val="22"/>
+          <w:szCs w:val="22"/>
+        </w:rPr>
+      </w:pPr>
+      <w:r>
+        <w:rPr>
+          <w:rFonts w:eastAsia="Times New Roman"/>
+          <w:color w:val="auto"/>
+          <w:sz w:val="22"/>
+          <w:szCs w:val="22"/>
+        </w:rPr>
+        <w:t>La gestión de una cartera compleja de proyectos requiere herramientas de visualización gerencial que permitan medir el desempeño operativo, evaluar la carga de trabajo real y anticipar cuellos de botella en las entregas.</w:t>
+      </w:r>
+    </w:p>
+    <w:p>
+      <w:pPr>
+        <w:pStyle w:val="Ttulo2"/>
+        <w:rPr>
+          <w:b/>
+          <w:sz w:val="24"/>
+          <w:szCs w:val="24"/>
+        </w:rPr>
+      </w:pPr>
+      <w:r>
+        <w:br/>
+      </w:r>
+      <w:r>
+        <w:rPr>
+          <w:b/>
+          <w:sz w:val="24"/>
+          <w:szCs w:val="24"/>
+        </w:rPr>
+        <w:t>Propuesta</w:t>
+      </w:r>
+    </w:p>
+    <w:p>
+      <w:pPr>
+        <w:pStyle w:val="Ttulo2"/>
+        <w:rPr>
+          <w:rFonts w:eastAsia="Times New Roman"/>
+          <w:color w:val="auto"/>
+          <w:sz w:val="22"/>
+          <w:szCs w:val="22"/>
+        </w:rPr>
+      </w:pPr>
+      <w:r>
+        <w:rPr>
+          <w:rFonts w:eastAsia="Times New Roman"/>
+          <w:color w:val="auto"/>
+          <w:sz w:val="22"/>
+          <w:szCs w:val="22"/>
+        </w:rPr>
+        <w:t>Incorporar herramientas de analítica y visualización que complementen la plataforma de gestión de proyectos del Departamento, permitiendo generar tableros ejecutivos automáticos, medir indicadores de capacidad operativa y facilitar la toma de decisiones informada.</w:t>
+      </w:r>
+    </w:p>
+    <w:p>
+      <w:pPr>
+        <w:pStyle w:val="Ttulo2"/>
+      </w:pPr>
+    </w:p>
+    <w:p>
+      <w:pPr>
+        <w:pStyle w:val="Ttulo2"/>
+        <w:rPr>
+          <w:b/>
+          <w:sz w:val="24"/>
+          <w:szCs w:val="24"/>
+        </w:rPr>
+      </w:pPr>
+      <w:r>
+        <w:rPr>
+          <w:b/>
+          <w:sz w:val="24"/>
+          <w:szCs w:val="24"/>
+        </w:rPr>
+        <w:t>Implementación</w:t>
+      </w:r>
+    </w:p>
+    <w:p>
+      <w:pPr>
+        <w:rPr>
+          <w:rFonts w:eastAsia="Times New Roman"/>
+        </w:rPr>
+      </w:pPr>
+      <w:r>
+        <w:rPr>
+          <w:rFonts w:eastAsia="Times New Roman"/>
+        </w:rPr>
+        <w:t>La implementación comprenderá:</w:t>
+      </w:r>
+    </w:p>
+    <w:p>
+      <w:pPr>
+        <w:ind w:left="708"/>
+        <w:rPr>
+          <w:rFonts w:eastAsia="Times New Roman"/>
+        </w:rPr>
+      </w:pPr>
+      <w:r>
+        <w:rPr>
+          <w:rFonts w:eastAsia="Times New Roman"/>
+        </w:rPr>
+        <w:t xml:space="preserve">• </w:t>
+      </w:r>
+      <w:proofErr w:type="gramStart"/>
+      <w:r>
+        <w:rPr>
+          <w:rFonts w:eastAsia="Times New Roman"/>
+        </w:rPr>
+        <w:t>integración</w:t>
+      </w:r>
+      <w:proofErr w:type="gramEnd"/>
+      <w:r>
+        <w:rPr>
+          <w:rFonts w:eastAsia="Times New Roman"/>
+        </w:rPr>
+        <w:t xml:space="preserve"> de módulos de analítica y tableros de control sobre la cartera de proyectos del Departamento;</w:t>
+      </w:r>
+    </w:p>
+    <w:p>
+      <w:pPr>
+        <w:ind w:left="708"/>
+        <w:rPr>
+          <w:rFonts w:eastAsia="Times New Roman"/>
+        </w:rPr>
+      </w:pPr>
+      <w:r>
+        <w:rPr>
+          <w:rFonts w:eastAsia="Times New Roman"/>
+        </w:rPr>
+        <w:t xml:space="preserve">• </w:t>
+      </w:r>
+      <w:proofErr w:type="gramStart"/>
+      <w:r>
+        <w:rPr>
+          <w:rFonts w:eastAsia="Times New Roman"/>
+        </w:rPr>
+        <w:t>definición</w:t>
+      </w:r>
+      <w:proofErr w:type="gramEnd"/>
+      <w:r>
+        <w:rPr>
+          <w:rFonts w:eastAsia="Times New Roman"/>
+        </w:rPr>
+        <w:t xml:space="preserve"> de paneles visuales para el seguimiento del estado de solicitudes, tiempos de respuesta y volumen de trabajo;</w:t>
+      </w:r>
+    </w:p>
+    <w:p>
+      <w:pPr>
+        <w:ind w:left="708"/>
+        <w:rPr>
+          <w:rFonts w:eastAsia="Times New Roman"/>
+        </w:rPr>
+      </w:pPr>
+      <w:r>
+        <w:rPr>
+          <w:rFonts w:eastAsia="Times New Roman"/>
+        </w:rPr>
+        <w:t xml:space="preserve">• </w:t>
+      </w:r>
+      <w:proofErr w:type="gramStart"/>
+      <w:r>
+        <w:rPr>
+          <w:rFonts w:eastAsia="Times New Roman"/>
+        </w:rPr>
+        <w:t>utilización</w:t>
+      </w:r>
+      <w:proofErr w:type="gramEnd"/>
+      <w:r>
+        <w:rPr>
+          <w:rFonts w:eastAsia="Times New Roman"/>
+        </w:rPr>
+        <w:t xml:space="preserve"> de métricas objetivas para informar la evolución de las iniciativas a las autoridades municipales.</w:t>
+      </w:r>
+    </w:p>
+    <w:p>
+      <w:pPr>
+        <w:ind w:left="708"/>
+        <w:rPr>
+          <w:rFonts w:eastAsia="Times New Roman"/>
+          <w:b/>
+          <w:sz w:val="24"/>
+          <w:szCs w:val="24"/>
+        </w:rPr>
+      </w:pPr>
+    </w:p>
+    <w:p>
+      <w:pPr>
+        <w:pStyle w:val="Ttulo2"/>
+        <w:rPr>
+          <w:b/>
+          <w:sz w:val="24"/>
+          <w:szCs w:val="24"/>
+        </w:rPr>
+      </w:pPr>
+      <w:r>
+        <w:rPr>
+          <w:b/>
+          <w:sz w:val="24"/>
+          <w:szCs w:val="24"/>
+        </w:rPr>
+        <w:t>Resultado esperado</w:t>
+      </w:r>
+    </w:p>
+    <w:p>
+      <w:pPr>
+        <w:pStyle w:val="Ttulo2"/>
+        <w:rPr>
+          <w:rFonts w:eastAsia="Times New Roman"/>
+          <w:color w:val="auto"/>
+          <w:sz w:val="22"/>
+          <w:szCs w:val="22"/>
+        </w:rPr>
+      </w:pPr>
+      <w:r>
+        <w:rPr>
+          <w:rFonts w:eastAsia="Times New Roman"/>
+          <w:color w:val="auto"/>
+          <w:sz w:val="22"/>
+          <w:szCs w:val="22"/>
+        </w:rPr>
+        <w:t>Se obtendrá visibilidad gerencial completa sobre la capacidad operativa del Departamento, optimizando la asignación de recursos y sustentando la toma de decisiones en evidencia objetiva.</w:t>
+      </w:r>
+    </w:p>
+    <w:p>
+      <w:pPr>
+        <w:pStyle w:val="Ttulo2"/>
+      </w:pPr>
+    </w:p>
+    <w:p>
+      <w:pPr>
+        <w:pStyle w:val="Ttulo2"/>
+        <w:rPr>
+          <w:b/>
+        </w:rPr>
+      </w:pPr>
+      <w:r>
+        <w:rPr>
+          <w:b/>
+        </w:rPr>
+        <w:t>6.6 Fortalecimiento gradual de la estructura técnica y especialización funcional</w:t>
+      </w:r>
+    </w:p>
+    <w:p>
+      <w:pPr>
+        <w:pStyle w:val="Ttulo2"/>
+        <w:rPr>
+          <w:b/>
+          <w:sz w:val="24"/>
+          <w:szCs w:val="24"/>
+        </w:rPr>
+      </w:pPr>
+      <w:r>
+        <w:rPr>
+          <w:b/>
+          <w:sz w:val="24"/>
+          <w:szCs w:val="24"/>
+        </w:rPr>
         <w:lastRenderedPageBreak/>
+        <w:t>Problema</w:t>
+      </w:r>
+    </w:p>
+    <w:p>
+      <w:pPr>
+        <w:pStyle w:val="Ttulo2"/>
+        <w:rPr>
+          <w:rFonts w:eastAsia="Times New Roman"/>
+          <w:color w:val="auto"/>
+          <w:sz w:val="22"/>
+          <w:szCs w:val="22"/>
+        </w:rPr>
+      </w:pPr>
+      <w:r>
+        <w:rPr>
+          <w:rFonts w:eastAsia="Times New Roman"/>
+          <w:color w:val="auto"/>
+          <w:sz w:val="22"/>
+          <w:szCs w:val="22"/>
+        </w:rPr>
+        <w:t>La dotación actual limita la posibilidad de asignar responsabilidades especializadas en análisis funcional, arquitectura de software, calidad y liderazgo técnico, obligando a los agentes a desempeñar simultáneamente múltiples funciones.</w:t>
+      </w:r>
+    </w:p>
+    <w:p>
+      <w:pPr>
+        <w:pStyle w:val="Ttulo2"/>
+        <w:rPr>
+          <w:b/>
+          <w:sz w:val="24"/>
+          <w:szCs w:val="24"/>
+        </w:rPr>
+      </w:pPr>
+      <w:r>
+        <w:rPr>
+          <w:b/>
+        </w:rPr>
+        <w:br/>
+      </w:r>
+      <w:r>
+        <w:rPr>
+          <w:b/>
+          <w:sz w:val="24"/>
+          <w:szCs w:val="24"/>
+        </w:rPr>
+        <w:t>Propuesta</w:t>
+      </w:r>
+    </w:p>
+    <w:p>
+      <w:pPr>
+        <w:pStyle w:val="Ttulo2"/>
+        <w:rPr>
+          <w:rFonts w:eastAsia="Times New Roman"/>
+          <w:color w:val="auto"/>
+          <w:sz w:val="22"/>
+          <w:szCs w:val="22"/>
+        </w:rPr>
+      </w:pPr>
+      <w:r>
+        <w:rPr>
+          <w:rFonts w:eastAsia="Times New Roman"/>
+          <w:color w:val="auto"/>
+          <w:sz w:val="22"/>
+          <w:szCs w:val="22"/>
+        </w:rPr>
+        <w:t>En función de la disponibilidad presupuestaria e incorporar recursos humanos, fortalecer progresivamente la estructura técnica del Departamento mediante la incorporación de perfiles profesionales que permitan consolidar una mayor especialización funcional y una mejor distribución de responsabilidades.</w:t>
+      </w:r>
+    </w:p>
+    <w:p>
+      <w:pPr>
+        <w:pStyle w:val="Ttulo2"/>
+      </w:pPr>
+    </w:p>
+    <w:p>
+      <w:pPr>
+        <w:pStyle w:val="Ttulo2"/>
+        <w:rPr>
+          <w:b/>
+          <w:sz w:val="24"/>
+          <w:szCs w:val="24"/>
+        </w:rPr>
+      </w:pPr>
+      <w:r>
+        <w:rPr>
+          <w:b/>
+          <w:sz w:val="24"/>
+          <w:szCs w:val="24"/>
+        </w:rPr>
+        <w:t>Implementación</w:t>
+      </w:r>
+    </w:p>
+    <w:p>
+      <w:pPr>
+        <w:rPr>
+          <w:rFonts w:eastAsia="Times New Roman"/>
+        </w:rPr>
+      </w:pPr>
+      <w:r>
+        <w:rPr>
+          <w:rFonts w:eastAsia="Times New Roman"/>
+        </w:rPr>
+        <w:t>La implementación comprenderá:</w:t>
+      </w:r>
+    </w:p>
+    <w:p>
+      <w:pPr>
+        <w:ind w:left="708"/>
+        <w:rPr>
+          <w:rFonts w:eastAsia="Times New Roman"/>
+        </w:rPr>
+      </w:pPr>
+      <w:r>
+        <w:rPr>
+          <w:rFonts w:eastAsia="Times New Roman"/>
+        </w:rPr>
         <w:t xml:space="preserve">• </w:t>
       </w:r>
       <w:proofErr w:type="gramStart"/>
@@ -4809,14 +5796,14 @@
         <w:rPr>
           <w:rFonts w:eastAsia="Times New Roman"/>
         </w:rPr>
-        <w:t>articulación</w:t>
+        <w:t>incorporación</w:t>
       </w:r>
       <w:proofErr w:type="gramEnd"/>
       <w:r>
         <w:rPr>
           <w:rFonts w:eastAsia="Times New Roman"/>
         </w:rPr>
-        <w:t xml:space="preserve"> técnica con el área de infraestructura para la optimización de los ambientes de prueba y producción.</w:t>
+        <w:t xml:space="preserve"> gradual de perfiles técnicos dedicados al desarrollo de software;</w:t>
       </w:r>
     </w:p>
     <w:p>
@@ -4826,6 +5813,103 @@
           <w:rFonts w:eastAsia="Times New Roman"/>
         </w:rPr>
       </w:pPr>
+      <w:r>
+        <w:rPr>
+          <w:rFonts w:eastAsia="Times New Roman"/>
+        </w:rPr>
+        <w:t xml:space="preserve">• </w:t>
+      </w:r>
+      <w:proofErr w:type="gramStart"/>
+      <w:r>
+        <w:rPr>
+          <w:rFonts w:eastAsia="Times New Roman"/>
+        </w:rPr>
+        <w:t>fortalecimiento</w:t>
+      </w:r>
+      <w:proofErr w:type="gramEnd"/>
+      <w:r>
+        <w:rPr>
+          <w:rFonts w:eastAsia="Times New Roman"/>
+        </w:rPr>
+        <w:t xml:space="preserve"> de las funciones de análisis funcional, arquitectura y aseguramiento de calidad asignadas a los perfiles de mayor experiencia;</w:t>
+      </w:r>
+    </w:p>
+    <w:p>
+      <w:pPr>
+        <w:ind w:left="708"/>
+        <w:rPr>
+          <w:rFonts w:eastAsia="Times New Roman"/>
+        </w:rPr>
+      </w:pPr>
+      <w:r>
+        <w:rPr>
+          <w:rFonts w:eastAsia="Times New Roman"/>
+        </w:rPr>
+        <w:t xml:space="preserve">• </w:t>
+      </w:r>
+      <w:proofErr w:type="gramStart"/>
+      <w:r>
+        <w:rPr>
+          <w:rFonts w:eastAsia="Times New Roman"/>
+        </w:rPr>
+        <w:t>conformación</w:t>
+      </w:r>
+      <w:proofErr w:type="gramEnd"/>
+      <w:r>
+        <w:rPr>
+          <w:rFonts w:eastAsia="Times New Roman"/>
+        </w:rPr>
+        <w:t xml:space="preserve"> de equipos con responsabilidades claramente definidas y esquemas de </w:t>
+      </w:r>
+      <w:proofErr w:type="spellStart"/>
+      <w:r>
+        <w:rPr>
+          <w:rFonts w:eastAsia="Times New Roman"/>
+        </w:rPr>
+        <w:t>mentoría</w:t>
+      </w:r>
+      <w:proofErr w:type="spellEnd"/>
+      <w:r>
+        <w:rPr>
+          <w:rFonts w:eastAsia="Times New Roman"/>
+        </w:rPr>
+        <w:t xml:space="preserve"> hacia el personal de reciente ingreso;</w:t>
+      </w:r>
+    </w:p>
+    <w:p>
+      <w:pPr>
+        <w:ind w:left="708"/>
+        <w:rPr>
+          <w:rFonts w:eastAsia="Times New Roman"/>
+        </w:rPr>
+      </w:pPr>
+      <w:r>
+        <w:rPr>
+          <w:rFonts w:eastAsia="Times New Roman"/>
+        </w:rPr>
+        <w:t xml:space="preserve">• </w:t>
+      </w:r>
+      <w:proofErr w:type="gramStart"/>
+      <w:r>
+        <w:rPr>
+          <w:rFonts w:eastAsia="Times New Roman"/>
+        </w:rPr>
+        <w:t>evaluación</w:t>
+      </w:r>
+      <w:proofErr w:type="gramEnd"/>
+      <w:r>
+        <w:rPr>
+          <w:rFonts w:eastAsia="Times New Roman"/>
+        </w:rPr>
+        <w:t xml:space="preserve"> periódica de la capacidad operativa y cohesión de los grupos de trabajo.</w:t>
+      </w:r>
+    </w:p>
+    <w:p>
+      <w:pPr>
+        <w:rPr>
+          <w:rFonts w:eastAsia="Times New Roman"/>
+        </w:rPr>
+      </w:pPr>
     </w:p>
     <w:p>
       <w:pPr>
@@ -4847,888 +5931,14 @@
     </w:p>
     <w:p>
       <w:pPr>
-        <w:pStyle w:val="Ttulo2"/>
-        <w:rPr>
-          <w:rFonts w:eastAsia="Times New Roman"/>
-          <w:color w:val="auto"/>
-          <w:sz w:val="22"/>
-          <w:szCs w:val="22"/>
-        </w:rPr>
-      </w:pPr>
-      <w:r>
-        <w:rPr>
-          <w:rFonts w:eastAsia="Times New Roman"/>
-          <w:color w:val="auto"/>
-          <w:sz w:val="22"/>
-          <w:szCs w:val="22"/>
-        </w:rPr>
-        <w:t>Se reducirá el riesgo asociado a tecnologías sin soporte, se simplificará el mantenimiento de los sistemas existentes y se incrementará la capacidad del Departamento para desarrollar nuevas soluciones digitales.</w:t>
-      </w:r>
-    </w:p>
-    <w:p>
-      <w:pPr>
-        <w:pStyle w:val="Ttulo2"/>
-        <w:rPr>
-          <w:rFonts w:eastAsia="Times New Roman"/>
-          <w:color w:val="auto"/>
-          <w:sz w:val="24"/>
-          <w:szCs w:val="24"/>
-        </w:rPr>
-      </w:pPr>
-    </w:p>
-    <w:p>
-      <w:pPr>
-        <w:pStyle w:val="Ttulo2"/>
-        <w:rPr>
-          <w:b/>
-        </w:rPr>
-      </w:pPr>
-      <w:r>
-        <w:rPr>
-          <w:b/>
-        </w:rPr>
-        <w:t>6.4 Fortalecimiento del trabajo colaborativo</w:t>
-      </w:r>
-    </w:p>
-    <w:p>
-      <w:pPr>
-        <w:pStyle w:val="Ttulo2"/>
-        <w:rPr>
-          <w:b/>
-          <w:sz w:val="24"/>
-          <w:szCs w:val="24"/>
-        </w:rPr>
-      </w:pPr>
-      <w:r>
-        <w:rPr>
-          <w:b/>
-          <w:sz w:val="24"/>
-          <w:szCs w:val="24"/>
-        </w:rPr>
-        <w:t>Problema</w:t>
-      </w:r>
-    </w:p>
-    <w:p>
-      <w:pPr>
-        <w:pStyle w:val="Ttulo2"/>
-        <w:rPr>
-          <w:rFonts w:eastAsia="Times New Roman"/>
-          <w:color w:val="auto"/>
-          <w:sz w:val="22"/>
-          <w:szCs w:val="22"/>
-        </w:rPr>
-      </w:pPr>
-      <w:r>
-        <w:rPr>
-          <w:rFonts w:eastAsia="Times New Roman"/>
-          <w:color w:val="auto"/>
-          <w:sz w:val="22"/>
-          <w:szCs w:val="22"/>
-        </w:rPr>
-        <w:t>La coordinación entre equipos distribuidos en distintas dependencias requiere herramientas que faciliten el intercambio permanente de información técnica, la colaboración continua y el acceso compartido al conocimiento institucional.</w:t>
-      </w:r>
-    </w:p>
-    <w:p>
-      <w:pPr>
-        <w:pStyle w:val="Ttulo2"/>
-        <w:rPr>
-          <w:b/>
-          <w:sz w:val="24"/>
-          <w:szCs w:val="24"/>
-        </w:rPr>
-      </w:pPr>
-      <w:r>
-        <w:br/>
-      </w:r>
-      <w:r>
-        <w:rPr>
-          <w:b/>
-          <w:sz w:val="24"/>
-          <w:szCs w:val="24"/>
-        </w:rPr>
-        <w:t>Propuesta</w:t>
-      </w:r>
-    </w:p>
-    <w:p>
-      <w:pPr>
-        <w:pStyle w:val="Ttulo2"/>
-        <w:rPr>
-          <w:rFonts w:eastAsia="Times New Roman"/>
-          <w:color w:val="auto"/>
-          <w:sz w:val="22"/>
-          <w:szCs w:val="22"/>
-        </w:rPr>
-      </w:pPr>
-      <w:r>
-        <w:rPr>
-          <w:rFonts w:eastAsia="Times New Roman"/>
-          <w:color w:val="auto"/>
-          <w:sz w:val="22"/>
-          <w:szCs w:val="22"/>
-        </w:rPr>
-        <w:t>Incorporar plataformas corporativas orientadas al trabajo colaborativo y a la gestión compartida del conocimiento, que permitan centralizar la documentación técnica de los sistemas, facilitar la revisión cruzada de código y mejorar la articulación entre los grupos de desarrollo.</w:t>
-      </w:r>
-    </w:p>
-    <w:p>
-      <w:pPr>
-        <w:pStyle w:val="Ttulo2"/>
-      </w:pPr>
-    </w:p>
-    <w:p>
-      <w:pPr>
-        <w:pStyle w:val="Ttulo2"/>
-        <w:rPr>
-          <w:b/>
-          <w:sz w:val="24"/>
-          <w:szCs w:val="24"/>
-        </w:rPr>
-      </w:pPr>
-      <w:r>
-        <w:rPr>
-          <w:b/>
-          <w:sz w:val="24"/>
-          <w:szCs w:val="24"/>
-        </w:rPr>
-        <w:t>Implementación</w:t>
-      </w:r>
-    </w:p>
-    <w:p>
-      <w:pPr>
-        <w:rPr>
-          <w:rFonts w:eastAsia="Times New Roman"/>
-          <w:sz w:val="24"/>
-          <w:szCs w:val="24"/>
-        </w:rPr>
-      </w:pPr>
-      <w:r>
-        <w:rPr>
-          <w:rFonts w:eastAsia="Times New Roman"/>
-          <w:sz w:val="24"/>
-          <w:szCs w:val="24"/>
-        </w:rPr>
-        <w:t>La implementación comprenderá:</w:t>
-      </w:r>
-    </w:p>
-    <w:p>
-      <w:pPr>
-        <w:ind w:left="708"/>
-        <w:rPr>
-          <w:rFonts w:eastAsia="Times New Roman"/>
-        </w:rPr>
-      </w:pPr>
-      <w:r>
-        <w:rPr>
-          <w:rFonts w:eastAsia="Times New Roman"/>
-        </w:rPr>
-        <w:t xml:space="preserve">• </w:t>
-      </w:r>
-      <w:proofErr w:type="gramStart"/>
-      <w:r>
-        <w:rPr>
-          <w:rFonts w:eastAsia="Times New Roman"/>
-        </w:rPr>
-        <w:t>incorporación</w:t>
-      </w:r>
-      <w:proofErr w:type="gramEnd"/>
-      <w:r>
-        <w:rPr>
-          <w:rFonts w:eastAsia="Times New Roman"/>
-        </w:rPr>
-        <w:t xml:space="preserve"> de plataformas colaborativas para la documentación técnica institucional;</w:t>
-      </w:r>
-    </w:p>
-    <w:p>
-      <w:pPr>
-        <w:ind w:left="708"/>
-        <w:rPr>
-          <w:rFonts w:eastAsia="Times New Roman"/>
-        </w:rPr>
-      </w:pPr>
-      <w:r>
-        <w:rPr>
-          <w:rFonts w:eastAsia="Times New Roman"/>
-        </w:rPr>
-        <w:t xml:space="preserve">• </w:t>
-      </w:r>
-      <w:proofErr w:type="gramStart"/>
-      <w:r>
-        <w:rPr>
-          <w:rFonts w:eastAsia="Times New Roman"/>
-        </w:rPr>
-        <w:t>implementación</w:t>
-      </w:r>
-      <w:proofErr w:type="gramEnd"/>
-      <w:r>
-        <w:rPr>
-          <w:rFonts w:eastAsia="Times New Roman"/>
-        </w:rPr>
-        <w:t xml:space="preserve"> de herramientas de repositorios de conocimiento y revisión compartida de desarrollos;</w:t>
-      </w:r>
-    </w:p>
-    <w:p>
-      <w:pPr>
-        <w:ind w:left="708"/>
-        <w:rPr>
-          <w:rFonts w:eastAsia="Times New Roman"/>
-        </w:rPr>
-      </w:pPr>
-      <w:r>
-        <w:rPr>
-          <w:rFonts w:eastAsia="Times New Roman"/>
-        </w:rPr>
-        <w:t xml:space="preserve">• </w:t>
-      </w:r>
-      <w:proofErr w:type="gramStart"/>
-      <w:r>
-        <w:rPr>
-          <w:rFonts w:eastAsia="Times New Roman"/>
-        </w:rPr>
-        <w:t>soluciones</w:t>
-      </w:r>
-      <w:proofErr w:type="gramEnd"/>
-      <w:r>
-        <w:rPr>
-          <w:rFonts w:eastAsia="Times New Roman"/>
-        </w:rPr>
-        <w:t xml:space="preserve"> que faciliten la comunicación fluida y la coordinación diaria entre equipos;</w:t>
-      </w:r>
-    </w:p>
-    <w:p>
-      <w:pPr>
-        <w:ind w:left="708"/>
-        <w:rPr>
-          <w:rFonts w:eastAsia="Times New Roman"/>
-        </w:rPr>
-      </w:pPr>
-      <w:r>
-        <w:rPr>
-          <w:rFonts w:eastAsia="Times New Roman"/>
-        </w:rPr>
-        <w:t xml:space="preserve">• </w:t>
-      </w:r>
-      <w:proofErr w:type="gramStart"/>
-      <w:r>
-        <w:rPr>
-          <w:rFonts w:eastAsia="Times New Roman"/>
-        </w:rPr>
-        <w:t>capacitación</w:t>
-      </w:r>
-      <w:proofErr w:type="gramEnd"/>
-      <w:r>
-        <w:rPr>
-          <w:rFonts w:eastAsia="Times New Roman"/>
-        </w:rPr>
-        <w:t xml:space="preserve"> al personal para promover su utilización sistemática.</w:t>
-      </w:r>
-    </w:p>
-    <w:p>
-      <w:pPr>
-        <w:ind w:left="708"/>
-        <w:rPr>
-          <w:rFonts w:eastAsia="Times New Roman"/>
-        </w:rPr>
-      </w:pPr>
-    </w:p>
-    <w:p>
-      <w:pPr>
-        <w:pStyle w:val="Ttulo2"/>
-        <w:rPr>
-          <w:b/>
-          <w:sz w:val="24"/>
-          <w:szCs w:val="24"/>
-        </w:rPr>
-      </w:pPr>
-      <w:r>
-        <w:rPr>
-          <w:b/>
-          <w:sz w:val="24"/>
-          <w:szCs w:val="24"/>
-        </w:rPr>
-        <w:t>Resultado esperado</w:t>
-      </w:r>
-    </w:p>
-    <w:p>
-      <w:pPr>
-        <w:rPr>
-          <w:rFonts w:eastAsia="Times New Roman"/>
-        </w:rPr>
-      </w:pPr>
-      <w:r>
-        <w:rPr>
-          <w:rFonts w:eastAsia="Times New Roman"/>
-        </w:rPr>
-        <w:t>Se fortalecerá la colaboración entre los distintos grupos de trabajo, se facilitará el acceso al conocimiento técnico acumulado, se eliminarán los silos informáticos y se mejorará la cohesión del Departamento.</w:t>
-      </w:r>
-    </w:p>
-    <w:p/>
-    <w:p>
-      <w:pPr>
-        <w:pStyle w:val="Ttulo2"/>
-        <w:rPr>
-          <w:b/>
-        </w:rPr>
-      </w:pPr>
-      <w:r>
-        <w:rPr>
-          <w:b/>
-        </w:rPr>
-        <w:t>6.5 Herramientas de analítica de proyectos y tableros ejecutivos</w:t>
-      </w:r>
-      <w:r>
-        <w:rPr>
-          <w:b/>
-        </w:rPr>
-        <w:tab/>
-      </w:r>
-    </w:p>
-    <w:p>
-      <w:pPr>
-        <w:pStyle w:val="Ttulo2"/>
-        <w:rPr>
-          <w:b/>
-          <w:sz w:val="24"/>
-          <w:szCs w:val="24"/>
-        </w:rPr>
-      </w:pPr>
-      <w:r>
-        <w:rPr>
-          <w:b/>
-          <w:sz w:val="24"/>
-          <w:szCs w:val="24"/>
-        </w:rPr>
-        <w:t>Problema</w:t>
-      </w:r>
-    </w:p>
-    <w:p>
-      <w:pPr>
-        <w:pStyle w:val="Ttulo2"/>
-        <w:rPr>
-          <w:rFonts w:eastAsia="Times New Roman"/>
-          <w:color w:val="auto"/>
-          <w:sz w:val="22"/>
-          <w:szCs w:val="22"/>
-        </w:rPr>
-      </w:pPr>
-      <w:r>
-        <w:rPr>
-          <w:rFonts w:eastAsia="Times New Roman"/>
-          <w:color w:val="auto"/>
-          <w:sz w:val="22"/>
-          <w:szCs w:val="22"/>
-        </w:rPr>
-        <w:t>La gestión de una cartera compleja de proyectos requiere herramientas de visualización gerencial que permitan medir el desempeño operativo, evaluar la carga de trabajo real y anticipar cuellos de botella en las entregas.</w:t>
-      </w:r>
-    </w:p>
-    <w:p>
-      <w:pPr>
-        <w:pStyle w:val="Ttulo2"/>
-        <w:rPr>
-          <w:b/>
-          <w:sz w:val="24"/>
-          <w:szCs w:val="24"/>
-        </w:rPr>
-      </w:pPr>
-      <w:r>
-        <w:br/>
-      </w:r>
-      <w:r>
-        <w:rPr>
-          <w:b/>
-          <w:sz w:val="24"/>
-          <w:szCs w:val="24"/>
-        </w:rPr>
-        <w:t>Propuesta</w:t>
-      </w:r>
-    </w:p>
-    <w:p>
-      <w:pPr>
-        <w:pStyle w:val="Ttulo2"/>
-        <w:rPr>
-          <w:rFonts w:eastAsia="Times New Roman"/>
-          <w:color w:val="auto"/>
-          <w:sz w:val="22"/>
-          <w:szCs w:val="22"/>
-        </w:rPr>
-      </w:pPr>
-      <w:r>
-        <w:rPr>
-          <w:rFonts w:eastAsia="Times New Roman"/>
-          <w:color w:val="auto"/>
-          <w:sz w:val="22"/>
-          <w:szCs w:val="22"/>
-        </w:rPr>
-        <w:lastRenderedPageBreak/>
-        <w:t>Incorporar herramientas de analítica y visualización que complementen la plataforma de gestión de proyectos del Departamento, permitiendo generar tableros ejecutivos automáticos, medir indicadores de capacidad operativa y facilitar la toma de decisiones informada.</w:t>
-      </w:r>
-    </w:p>
-    <w:p>
-      <w:pPr>
-        <w:pStyle w:val="Ttulo2"/>
-      </w:pPr>
-    </w:p>
-    <w:p>
-      <w:pPr>
-        <w:pStyle w:val="Ttulo2"/>
-        <w:rPr>
-          <w:b/>
-          <w:sz w:val="24"/>
-          <w:szCs w:val="24"/>
-        </w:rPr>
-      </w:pPr>
-      <w:r>
-        <w:rPr>
-          <w:b/>
-          <w:sz w:val="24"/>
-          <w:szCs w:val="24"/>
-        </w:rPr>
-        <w:t>Implementación</w:t>
-      </w:r>
-    </w:p>
-    <w:p>
-      <w:pPr>
-        <w:rPr>
-          <w:rFonts w:eastAsia="Times New Roman"/>
-        </w:rPr>
-      </w:pPr>
-      <w:r>
-        <w:rPr>
-          <w:rFonts w:eastAsia="Times New Roman"/>
-        </w:rPr>
-        <w:t>La implementación comprenderá:</w:t>
-      </w:r>
-    </w:p>
-    <w:p>
-      <w:pPr>
-        <w:ind w:left="708"/>
-        <w:rPr>
-          <w:rFonts w:eastAsia="Times New Roman"/>
-        </w:rPr>
-      </w:pPr>
-      <w:r>
-        <w:rPr>
-          <w:rFonts w:eastAsia="Times New Roman"/>
-        </w:rPr>
-        <w:t xml:space="preserve">• </w:t>
-      </w:r>
-      <w:proofErr w:type="gramStart"/>
-      <w:r>
-        <w:rPr>
-          <w:rFonts w:eastAsia="Times New Roman"/>
-        </w:rPr>
-        <w:t>integración</w:t>
-      </w:r>
-      <w:proofErr w:type="gramEnd"/>
-      <w:r>
-        <w:rPr>
-          <w:rFonts w:eastAsia="Times New Roman"/>
-        </w:rPr>
-        <w:t xml:space="preserve"> de módulos de analítica y tableros de control sobre la cartera de proyectos del Departamento;</w:t>
-      </w:r>
-    </w:p>
-    <w:p>
-      <w:pPr>
-        <w:ind w:left="708"/>
-        <w:rPr>
-          <w:rFonts w:eastAsia="Times New Roman"/>
-        </w:rPr>
-      </w:pPr>
-      <w:r>
-        <w:rPr>
-          <w:rFonts w:eastAsia="Times New Roman"/>
-        </w:rPr>
-        <w:t xml:space="preserve">• </w:t>
-      </w:r>
-      <w:proofErr w:type="gramStart"/>
-      <w:r>
-        <w:rPr>
-          <w:rFonts w:eastAsia="Times New Roman"/>
-        </w:rPr>
-        <w:t>definición</w:t>
-      </w:r>
-      <w:proofErr w:type="gramEnd"/>
-      <w:r>
-        <w:rPr>
-          <w:rFonts w:eastAsia="Times New Roman"/>
-        </w:rPr>
-        <w:t xml:space="preserve"> de paneles visuales para el seguimiento del estado de solicitudes, tiempos de respuesta y volumen de trabajo;</w:t>
-      </w:r>
-    </w:p>
-    <w:p>
-      <w:pPr>
-        <w:ind w:left="708"/>
-        <w:rPr>
-          <w:rFonts w:eastAsia="Times New Roman"/>
-        </w:rPr>
-      </w:pPr>
-      <w:r>
-        <w:rPr>
-          <w:rFonts w:eastAsia="Times New Roman"/>
-        </w:rPr>
-        <w:t xml:space="preserve">• </w:t>
-      </w:r>
-      <w:proofErr w:type="gramStart"/>
-      <w:r>
-        <w:rPr>
-          <w:rFonts w:eastAsia="Times New Roman"/>
-        </w:rPr>
-        <w:t>utilización</w:t>
-      </w:r>
-      <w:proofErr w:type="gramEnd"/>
-      <w:r>
-        <w:rPr>
-          <w:rFonts w:eastAsia="Times New Roman"/>
-        </w:rPr>
-        <w:t xml:space="preserve"> de métricas objetivas para informar la evolución de las iniciativas a las autoridades municipales.</w:t>
-      </w:r>
-    </w:p>
-    <w:p>
-      <w:pPr>
-        <w:ind w:left="708"/>
-        <w:rPr>
-          <w:rFonts w:eastAsia="Times New Roman"/>
-          <w:b/>
-          <w:sz w:val="24"/>
-          <w:szCs w:val="24"/>
-        </w:rPr>
-      </w:pPr>
-    </w:p>
-    <w:p>
-      <w:pPr>
-        <w:pStyle w:val="Ttulo2"/>
-        <w:rPr>
-          <w:b/>
-          <w:sz w:val="24"/>
-          <w:szCs w:val="24"/>
-        </w:rPr>
-      </w:pPr>
-      <w:r>
-        <w:rPr>
-          <w:b/>
-          <w:sz w:val="24"/>
-          <w:szCs w:val="24"/>
-        </w:rPr>
-        <w:t>Resultado esperado</w:t>
-      </w:r>
-    </w:p>
-    <w:p>
-      <w:pPr>
-        <w:pStyle w:val="Ttulo2"/>
-        <w:rPr>
-          <w:rFonts w:eastAsia="Times New Roman"/>
-          <w:color w:val="auto"/>
-          <w:sz w:val="22"/>
-          <w:szCs w:val="22"/>
-        </w:rPr>
-      </w:pPr>
-      <w:r>
-        <w:rPr>
-          <w:rFonts w:eastAsia="Times New Roman"/>
-          <w:color w:val="auto"/>
-          <w:sz w:val="22"/>
-          <w:szCs w:val="22"/>
-        </w:rPr>
-        <w:t>Se obtendrá visibilidad gerencial completa sobre la capacidad operativa del Departamento, optimizando la asignación de recursos y sustentando la toma de decisiones en evidencia objetiva.</w:t>
-      </w:r>
-    </w:p>
-    <w:p>
-      <w:pPr>
-        <w:pStyle w:val="Ttulo2"/>
-      </w:pPr>
-    </w:p>
-    <w:p>
-      <w:pPr>
-        <w:pStyle w:val="Ttulo2"/>
-        <w:rPr>
-          <w:b/>
-        </w:rPr>
-      </w:pPr>
-      <w:r>
-        <w:rPr>
-          <w:b/>
-        </w:rPr>
-        <w:t>6.6 Fortalecimiento gradual de la estructura técnica y especialización funcional</w:t>
-      </w:r>
-    </w:p>
-    <w:p>
-      <w:pPr>
-        <w:pStyle w:val="Ttulo2"/>
-        <w:rPr>
-          <w:b/>
-          <w:sz w:val="24"/>
-          <w:szCs w:val="24"/>
-        </w:rPr>
-      </w:pPr>
-      <w:r>
-        <w:rPr>
-          <w:b/>
-          <w:sz w:val="24"/>
-          <w:szCs w:val="24"/>
-        </w:rPr>
-        <w:t>Problema</w:t>
-      </w:r>
-    </w:p>
-    <w:p>
-      <w:pPr>
-        <w:pStyle w:val="Ttulo2"/>
-        <w:rPr>
-          <w:rFonts w:eastAsia="Times New Roman"/>
-          <w:color w:val="auto"/>
-          <w:sz w:val="22"/>
-          <w:szCs w:val="22"/>
-        </w:rPr>
-      </w:pPr>
-      <w:r>
-        <w:rPr>
-          <w:rFonts w:eastAsia="Times New Roman"/>
-          <w:color w:val="auto"/>
-          <w:sz w:val="22"/>
-          <w:szCs w:val="22"/>
-        </w:rPr>
-        <w:t>La dotación actual limita la posibilidad de asignar responsabilidades especializadas en análisis funcional, arquitectura de software, calidad y liderazgo técnico, obligando a los agentes a desempeñar simultáneamente múltiples funciones.</w:t>
-      </w:r>
-    </w:p>
-    <w:p>
-      <w:pPr>
-        <w:pStyle w:val="Ttulo2"/>
-        <w:rPr>
-          <w:b/>
-          <w:sz w:val="24"/>
-          <w:szCs w:val="24"/>
-        </w:rPr>
-      </w:pPr>
-      <w:r>
-        <w:rPr>
-          <w:b/>
-        </w:rPr>
-        <w:br/>
-      </w:r>
-      <w:r>
-        <w:rPr>
-          <w:b/>
-          <w:sz w:val="24"/>
-          <w:szCs w:val="24"/>
-        </w:rPr>
-        <w:t>Propuesta</w:t>
-      </w:r>
-    </w:p>
-    <w:p>
-      <w:pPr>
-        <w:pStyle w:val="Ttulo2"/>
-        <w:rPr>
-          <w:rFonts w:eastAsia="Times New Roman"/>
-          <w:color w:val="auto"/>
-          <w:sz w:val="22"/>
-          <w:szCs w:val="22"/>
-        </w:rPr>
-      </w:pPr>
-      <w:r>
-        <w:rPr>
-          <w:rFonts w:eastAsia="Times New Roman"/>
-          <w:color w:val="auto"/>
-          <w:sz w:val="22"/>
-          <w:szCs w:val="22"/>
-        </w:rPr>
-        <w:t>En función de la disponibilidad presupuestaria e incorporar recursos humanos, fortalecer progresivamente la estructura técnica del Departamento mediante la incorporación de perfiles profesionales que permitan consolidar una mayor especialización funcional y una mejor distribución de responsabilidades.</w:t>
-      </w:r>
-    </w:p>
-    <w:p>
-      <w:pPr>
-        <w:pStyle w:val="Ttulo2"/>
-      </w:pPr>
-    </w:p>
-    <w:p>
-      <w:pPr>
-        <w:pStyle w:val="Ttulo2"/>
-        <w:rPr>
-          <w:b/>
-          <w:sz w:val="24"/>
-          <w:szCs w:val="24"/>
-        </w:rPr>
-      </w:pPr>
-      <w:r>
-        <w:rPr>
-          <w:b/>
-          <w:sz w:val="24"/>
-          <w:szCs w:val="24"/>
-        </w:rPr>
-        <w:t>Implementación</w:t>
-      </w:r>
-    </w:p>
-    <w:p>
-      <w:pPr>
-        <w:rPr>
-          <w:rFonts w:eastAsia="Times New Roman"/>
-        </w:rPr>
-      </w:pPr>
-      <w:r>
-        <w:rPr>
-          <w:rFonts w:eastAsia="Times New Roman"/>
-        </w:rPr>
-        <w:t>La implementación comprenderá:</w:t>
-      </w:r>
-    </w:p>
-    <w:p>
-      <w:pPr>
-        <w:ind w:left="708"/>
-        <w:rPr>
-          <w:rFonts w:eastAsia="Times New Roman"/>
-        </w:rPr>
-      </w:pPr>
-      <w:r>
-        <w:rPr>
-          <w:rFonts w:eastAsia="Times New Roman"/>
-        </w:rPr>
-        <w:t xml:space="preserve">• </w:t>
-      </w:r>
-      <w:proofErr w:type="gramStart"/>
-      <w:r>
-        <w:rPr>
-          <w:rFonts w:eastAsia="Times New Roman"/>
-        </w:rPr>
-        <w:t>incorporación</w:t>
-      </w:r>
-      <w:proofErr w:type="gramEnd"/>
-      <w:r>
-        <w:rPr>
-          <w:rFonts w:eastAsia="Times New Roman"/>
-        </w:rPr>
-        <w:t xml:space="preserve"> gradual de perfiles técnicos dedicados al desarrollo de software;</w:t>
-      </w:r>
-    </w:p>
-    <w:p>
-      <w:pPr>
-        <w:ind w:left="708"/>
-        <w:rPr>
-          <w:rFonts w:eastAsia="Times New Roman"/>
-        </w:rPr>
-      </w:pPr>
-      <w:r>
-        <w:rPr>
-          <w:rFonts w:eastAsia="Times New Roman"/>
-        </w:rPr>
-        <w:t xml:space="preserve">• </w:t>
-      </w:r>
-      <w:proofErr w:type="gramStart"/>
-      <w:r>
-        <w:rPr>
-          <w:rFonts w:eastAsia="Times New Roman"/>
-        </w:rPr>
-        <w:t>fortalecimiento</w:t>
-      </w:r>
-      <w:proofErr w:type="gramEnd"/>
-      <w:r>
-        <w:rPr>
-          <w:rFonts w:eastAsia="Times New Roman"/>
-        </w:rPr>
-        <w:t xml:space="preserve"> de las funciones de análisis funcional, arquitectura y aseguramiento de calidad asignadas a los perfiles de mayor experiencia;</w:t>
-      </w:r>
-    </w:p>
-    <w:p>
-      <w:pPr>
-        <w:ind w:left="708"/>
-        <w:rPr>
-          <w:rFonts w:eastAsia="Times New Roman"/>
-        </w:rPr>
-      </w:pPr>
-      <w:r>
-        <w:rPr>
-          <w:rFonts w:eastAsia="Times New Roman"/>
-        </w:rPr>
-        <w:t xml:space="preserve">• </w:t>
-      </w:r>
-      <w:proofErr w:type="gramStart"/>
-      <w:r>
-        <w:rPr>
-          <w:rFonts w:eastAsia="Times New Roman"/>
-        </w:rPr>
-        <w:t>conformación</w:t>
-      </w:r>
-      <w:proofErr w:type="gramEnd"/>
-      <w:r>
-        <w:rPr>
-          <w:rFonts w:eastAsia="Times New Roman"/>
-        </w:rPr>
-        <w:t xml:space="preserve"> de equipos con responsabilidades claramente definidas y esquemas de </w:t>
-      </w:r>
-      <w:proofErr w:type="spellStart"/>
-      <w:r>
-        <w:rPr>
-          <w:rFonts w:eastAsia="Times New Roman"/>
-        </w:rPr>
-        <w:t>mentoría</w:t>
-      </w:r>
-      <w:proofErr w:type="spellEnd"/>
-      <w:r>
-        <w:rPr>
-          <w:rFonts w:eastAsia="Times New Roman"/>
-        </w:rPr>
-        <w:t xml:space="preserve"> hacia el personal de reciente ingreso;</w:t>
-      </w:r>
-    </w:p>
-    <w:p>
-      <w:pPr>
-        <w:ind w:left="708"/>
-        <w:rPr>
-          <w:rFonts w:eastAsia="Times New Roman"/>
-        </w:rPr>
-      </w:pPr>
-      <w:r>
-        <w:rPr>
-          <w:rFonts w:eastAsia="Times New Roman"/>
-        </w:rPr>
-        <w:t xml:space="preserve">• </w:t>
-      </w:r>
-      <w:proofErr w:type="gramStart"/>
-      <w:r>
-        <w:rPr>
-          <w:rFonts w:eastAsia="Times New Roman"/>
-        </w:rPr>
-        <w:t>evaluación</w:t>
-      </w:r>
-      <w:proofErr w:type="gramEnd"/>
-      <w:r>
-        <w:rPr>
-          <w:rFonts w:eastAsia="Times New Roman"/>
-        </w:rPr>
-        <w:t xml:space="preserve"> periódica de la capacidad operativa y cohesión de los grupos de trabajo.</w:t>
-      </w:r>
-    </w:p>
-    <w:p>
-      <w:pPr>
-        <w:rPr>
-          <w:rFonts w:eastAsia="Times New Roman"/>
-        </w:rPr>
-      </w:pPr>
-    </w:p>
-    <w:p>
-      <w:pPr>
-        <w:pStyle w:val="Ttulo2"/>
-        <w:rPr>
-          <w:b/>
-          <w:sz w:val="24"/>
-          <w:szCs w:val="24"/>
-        </w:rPr>
-      </w:pPr>
-      <w:r>
-        <w:rPr>
-          <w:b/>
-          <w:sz w:val="24"/>
-          <w:szCs w:val="24"/>
-        </w:rPr>
-        <w:t>Resultado esperado</w:t>
-      </w:r>
-    </w:p>
-    <w:p>
-      <w:pPr>
-        <w:rPr>
-          <w:rFonts w:eastAsia="Times New Roman"/>
-        </w:rPr>
-      </w:pPr>
-      <w:r>
-        <w:rPr>
-          <w:rFonts w:eastAsia="Times New Roman"/>
-        </w:rPr>
-        <w:lastRenderedPageBreak/>
+        <w:rPr>
+          <w:rFonts w:eastAsia="Times New Roman"/>
+        </w:rPr>
+      </w:pPr>
+      <w:r>
+        <w:rPr>
+          <w:rFonts w:eastAsia="Times New Roman"/>
+        </w:rPr>
         <w:t>Se optimizará la distribución de responsabilidades, aumentará la capacidad operativa del Departamento para responder a nuevas demandas y se preservará sostenidamente el conocimiento del negocio municipal.</w:t>
       </w:r>
     </w:p>
@@ -5867,7 +6077,14 @@
         <w:rPr>
           <w:rFonts w:eastAsia="Times New Roman"/>
         </w:rPr>
-        <w:t>Se realizará un relevamiento operativo del Departamento que comprenderá: la cartera de proyectos y requerimientos, sistemas críticos, distribución del conocimiento, experiencia del personal, estado de documentación, integraciones entre sistemas y capacidad</w:t>
+        <w:t xml:space="preserve">Se realizará un relevamiento operativo del Departamento que comprenderá: la cartera de proyectos y requerimientos, sistemas críticos, distribución del conocimiento, experiencia del </w:t>
+      </w:r>
+      <w:r>
+        <w:rPr>
+          <w:rFonts w:eastAsia="Times New Roman"/>
+        </w:rPr>
+        <w:lastRenderedPageBreak/>
+        <w:t>personal, estado de documentación, integraciones entre sistemas y capacidad</w:t>
       </w:r>
       <w:r>
         <w:rPr>
@@ -6139,7 +6356,6 @@
         <w:rPr>
           <w:rFonts w:eastAsia="Times New Roman"/>
         </w:rPr>
-        <w:lastRenderedPageBreak/>
         <w:t>La incorporación de cada medida será acompañada por la evaluación de sus resultados y por los ajustes que sean necesarios para adecuarla a la realidad operativa del Departamento.</w:t>
       </w:r>
     </w:p>
@@ -6271,6 +6487,7 @@
         <w:rPr>
           <w:b/>
         </w:rPr>
+        <w:lastRenderedPageBreak/>
         <w:t>8.1  Revisión periódica de resultados e indicadores de gestión</w:t>
       </w:r>
     </w:p>
@@ -6433,7 +6650,6 @@
         <w:rPr>
           <w:rFonts w:eastAsia="Times New Roman"/>
         </w:rPr>
-        <w:lastRenderedPageBreak/>
         <w:t xml:space="preserve">• </w:t>
       </w:r>
       <w:proofErr w:type="spellStart"/>
@@ -8283,6 +8499,119 @@
     </w:lvl>
   </w:abstractNum>
   <w:abstractNum w:abstractNumId="12">
+    <w:nsid w:val="5D541B2F"/>
+    <w:multiLevelType w:val="hybridMultilevel"/>
+    <w:tmpl w:val="38A22E3A"/>
+    <w:lvl w:ilvl="0" w:tplc="2C0A0001">
+      <w:start w:val="1"/>
+      <w:numFmt w:val="bullet"/>
+      <w:lvlText w:val=""/>
+      <w:lvlJc w:val="left"/>
+      <w:pPr>
+        <w:ind w:left="1428" w:hanging="360"/>
+      </w:pPr>
+      <w:rPr>
+        <w:rFonts w:ascii="Symbol" w:hAnsi="Symbol" w:hint="default"/>
+      </w:rPr>
+    </w:lvl>
+    <w:lvl w:ilvl="1" w:tplc="2C0A0003" w:tentative="1">
+      <w:start w:val="1"/>
+      <w:numFmt w:val="bullet"/>
+      <w:lvlText w:val="o"/>
+      <w:lvlJc w:val="left"/>
+      <w:pPr>
+        <w:ind w:left="2148" w:hanging="360"/>
+      </w:pPr>
+      <w:rPr>
+        <w:rFonts w:ascii="Courier New" w:hAnsi="Courier New" w:cs="Courier New" w:hint="default"/>
+      </w:rPr>
+    </w:lvl>
+    <w:lvl w:ilvl="2" w:tplc="2C0A0005" w:tentative="1">
+      <w:start w:val="1"/>
+      <w:numFmt w:val="bullet"/>
+      <w:lvlText w:val=""/>
+      <w:lvlJc w:val="left"/>
+      <w:pPr>
+        <w:ind w:left="2868" w:hanging="360"/>
+      </w:pPr>
+      <w:rPr>
+        <w:rFonts w:ascii="Wingdings" w:hAnsi="Wingdings" w:hint="default"/>
+      </w:rPr>
+    </w:lvl>
+    <w:lvl w:ilvl="3" w:tplc="2C0A0001" w:tentative="1">
+      <w:start w:val="1"/>
+      <w:numFmt w:val="bullet"/>
+      <w:lvlText w:val=""/>
+      <w:lvlJc w:val="left"/>
+      <w:pPr>
+        <w:ind w:left="3588" w:hanging="360"/>
+      </w:pPr>
+      <w:rPr>
+        <w:rFonts w:ascii="Symbol" w:hAnsi="Symbol" w:hint="default"/>
+      </w:rPr>
+    </w:lvl>
+    <w:lvl w:ilvl="4" w:tplc="2C0A0003" w:tentative="1">
+      <w:start w:val="1"/>
+      <w:numFmt w:val="bullet"/>
+      <w:lvlText w:val="o"/>
+      <w:lvlJc w:val="left"/>
+      <w:pPr>
+        <w:ind w:left="4308" w:hanging="360"/>
+      </w:pPr>
+      <w:rPr>
+        <w:rFonts w:ascii="Courier New" w:hAnsi="Courier New" w:cs="Courier New" w:hint="default"/>
+      </w:rPr>
+    </w:lvl>
+    <w:lvl w:ilvl="5" w:tplc="2C0A0005" w:tentative="1">
+      <w:start w:val="1"/>
+      <w:numFmt w:val="bullet"/>
+      <w:lvlText w:val=""/>
+      <w:lvlJc w:val="left"/>
+      <w:pPr>
+        <w:ind w:left="5028" w:hanging="360"/>
+      </w:pPr>
+      <w:rPr>
+        <w:rFonts w:ascii="Wingdings" w:hAnsi="Wingdings" w:hint="default"/>
+      </w:rPr>
+    </w:lvl>
+    <w:lvl w:ilvl="6" w:tplc="2C0A0001" w:tentative="1">
+      <w:start w:val="1"/>
+      <w:numFmt w:val="bullet"/>
+      <w:lvlText w:val=""/>
+      <w:lvlJc w:val="left"/>
+      <w:pPr>
+        <w:ind w:left="5748" w:hanging="360"/>
+      </w:pPr>
+      <w:rPr>
+        <w:rFonts w:ascii="Symbol" w:hAnsi="Symbol" w:hint="default"/>
+      </w:rPr>
+    </w:lvl>
+    <w:lvl w:ilvl="7" w:tplc="2C0A0003" w:tentative="1">
+      <w:start w:val="1"/>
+      <w:numFmt w:val="bullet"/>
+      <w:lvlText w:val="o"/>
+      <w:lvlJc w:val="left"/>
+      <w:pPr>
+        <w:ind w:left="6468" w:hanging="360"/>
+      </w:pPr>
+      <w:rPr>
+        <w:rFonts w:ascii="Courier New" w:hAnsi="Courier New" w:cs="Courier New" w:hint="default"/>
+      </w:rPr>
+    </w:lvl>
+    <w:lvl w:ilvl="8" w:tplc="2C0A0005" w:tentative="1">
+      <w:start w:val="1"/>
+      <w:numFmt w:val="bullet"/>
+      <w:lvlText w:val=""/>
+      <w:lvlJc w:val="left"/>
+      <w:pPr>
+        <w:ind w:left="7188" w:hanging="360"/>
+      </w:pPr>
+      <w:rPr>
+        <w:rFonts w:ascii="Wingdings" w:hAnsi="Wingdings" w:hint="default"/>
+      </w:rPr>
+    </w:lvl>
+  </w:abstractNum>
+  <w:abstractNum w:abstractNumId="13">
     <w:nsid w:val="648D41A3"/>
     <w:multiLevelType w:val="multilevel"/>
     <w:tmpl w:val="791479FC"/>
@@ -8431,7 +8760,7 @@
       </w:rPr>
     </w:lvl>
   </w:abstractNum>
-  <w:abstractNum w:abstractNumId="13">
+  <w:abstractNum w:abstractNumId="14">
     <w:nsid w:val="64A71AE6"/>
     <w:multiLevelType w:val="multilevel"/>
     <w:tmpl w:val="2F9E4154"/>
@@ -8577,6 +8906,119 @@
       <w:rPr>
         <w:rFonts w:ascii="Wingdings" w:hAnsi="Wingdings" w:hint="default"/>
         <w:sz w:val="20"/>
+      </w:rPr>
+    </w:lvl>
+  </w:abstractNum>
+  <w:abstractNum w:abstractNumId="15">
+    <w:nsid w:val="72C70DD3"/>
+    <w:multiLevelType w:val="hybridMultilevel"/>
+    <w:tmpl w:val="0554BF3E"/>
+    <w:lvl w:ilvl="0" w:tplc="2C0A0001">
+      <w:start w:val="1"/>
+      <w:numFmt w:val="bullet"/>
+      <w:lvlText w:val=""/>
+      <w:lvlJc w:val="left"/>
+      <w:pPr>
+        <w:ind w:left="1428" w:hanging="360"/>
+      </w:pPr>
+      <w:rPr>
+        <w:rFonts w:ascii="Symbol" w:hAnsi="Symbol" w:hint="default"/>
+      </w:rPr>
+    </w:lvl>
+    <w:lvl w:ilvl="1" w:tplc="2C0A0003" w:tentative="1">
+      <w:start w:val="1"/>
+      <w:numFmt w:val="bullet"/>
+      <w:lvlText w:val="o"/>
+      <w:lvlJc w:val="left"/>
+      <w:pPr>
+        <w:ind w:left="2148" w:hanging="360"/>
+      </w:pPr>
+      <w:rPr>
+        <w:rFonts w:ascii="Courier New" w:hAnsi="Courier New" w:cs="Courier New" w:hint="default"/>
+      </w:rPr>
+    </w:lvl>
+    <w:lvl w:ilvl="2" w:tplc="2C0A0005" w:tentative="1">
+      <w:start w:val="1"/>
+      <w:numFmt w:val="bullet"/>
+      <w:lvlText w:val=""/>
+      <w:lvlJc w:val="left"/>
+      <w:pPr>
+        <w:ind w:left="2868" w:hanging="360"/>
+      </w:pPr>
+      <w:rPr>
+        <w:rFonts w:ascii="Wingdings" w:hAnsi="Wingdings" w:hint="default"/>
+      </w:rPr>
+    </w:lvl>
+    <w:lvl w:ilvl="3" w:tplc="2C0A0001" w:tentative="1">
+      <w:start w:val="1"/>
+      <w:numFmt w:val="bullet"/>
+      <w:lvlText w:val=""/>
+      <w:lvlJc w:val="left"/>
+      <w:pPr>
+        <w:ind w:left="3588" w:hanging="360"/>
+      </w:pPr>
+      <w:rPr>
+        <w:rFonts w:ascii="Symbol" w:hAnsi="Symbol" w:hint="default"/>
+      </w:rPr>
+    </w:lvl>
+    <w:lvl w:ilvl="4" w:tplc="2C0A0003" w:tentative="1">
+      <w:start w:val="1"/>
+      <w:numFmt w:val="bullet"/>
+      <w:lvlText w:val="o"/>
+      <w:lvlJc w:val="left"/>
+      <w:pPr>
+        <w:ind w:left="4308" w:hanging="360"/>
+      </w:pPr>
+      <w:rPr>
+        <w:rFonts w:ascii="Courier New" w:hAnsi="Courier New" w:cs="Courier New" w:hint="default"/>
+      </w:rPr>
+    </w:lvl>
+    <w:lvl w:ilvl="5" w:tplc="2C0A0005" w:tentative="1">
+      <w:start w:val="1"/>
+      <w:numFmt w:val="bullet"/>
+      <w:lvlText w:val=""/>
+      <w:lvlJc w:val="left"/>
+      <w:pPr>
+        <w:ind w:left="5028" w:hanging="360"/>
+      </w:pPr>
+      <w:rPr>
+        <w:rFonts w:ascii="Wingdings" w:hAnsi="Wingdings" w:hint="default"/>
+      </w:rPr>
+    </w:lvl>
+    <w:lvl w:ilvl="6" w:tplc="2C0A0001" w:tentative="1">
+      <w:start w:val="1"/>
+      <w:numFmt w:val="bullet"/>
+      <w:lvlText w:val=""/>
+      <w:lvlJc w:val="left"/>
+      <w:pPr>
+        <w:ind w:left="5748" w:hanging="360"/>
+      </w:pPr>
+      <w:rPr>
+        <w:rFonts w:ascii="Symbol" w:hAnsi="Symbol" w:hint="default"/>
+      </w:rPr>
+    </w:lvl>
+    <w:lvl w:ilvl="7" w:tplc="2C0A0003" w:tentative="1">
+      <w:start w:val="1"/>
+      <w:numFmt w:val="bullet"/>
+      <w:lvlText w:val="o"/>
+      <w:lvlJc w:val="left"/>
+      <w:pPr>
+        <w:ind w:left="6468" w:hanging="360"/>
+      </w:pPr>
+      <w:rPr>
+        <w:rFonts w:ascii="Courier New" w:hAnsi="Courier New" w:cs="Courier New" w:hint="default"/>
+      </w:rPr>
+    </w:lvl>
+    <w:lvl w:ilvl="8" w:tplc="2C0A0005" w:tentative="1">
+      <w:start w:val="1"/>
+      <w:numFmt w:val="bullet"/>
+      <w:lvlText w:val=""/>
+      <w:lvlJc w:val="left"/>
+      <w:pPr>
+        <w:ind w:left="7188" w:hanging="360"/>
+      </w:pPr>
+      <w:rPr>
+        <w:rFonts w:ascii="Wingdings" w:hAnsi="Wingdings" w:hint="default"/>
       </w:rPr>
     </w:lvl>
   </w:abstractNum>
@@ -8602,13 +9044,13 @@
     <w:abstractNumId w:val="2"/>
   </w:num>
   <w:num w:numId="7">
-    <w:abstractNumId w:val="12"/>
+    <w:abstractNumId w:val="13"/>
   </w:num>
   <w:num w:numId="8">
     <w:abstractNumId w:val="3"/>
   </w:num>
   <w:num w:numId="9">
-    <w:abstractNumId w:val="13"/>
+    <w:abstractNumId w:val="14"/>
   </w:num>
   <w:num w:numId="10">
     <w:abstractNumId w:val="10"/>
@@ -8645,6 +9087,12 @@
   </w:num>
   <w:num w:numId="21">
     <w:abstractNumId w:val="9"/>
+  </w:num>
+  <w:num w:numId="22">
+    <w:abstractNumId w:val="15"/>
+  </w:num>
+  <w:num w:numId="23">
+    <w:abstractNumId w:val="12"/>
   </w:num>
 </w:numbering>
 </file>

</xml_diff>